<commit_message>
Actualización ERS: Requerimientos funcionales tabulados, RNF y Arquitectura Base
</commit_message>
<xml_diff>
--- a/- 02 Specificacion de requerimientos/Specificacion de requerimientos.docx
+++ b/- 02 Specificacion de requerimientos/Specificacion de requerimientos.docx
@@ -33,33 +33,15 @@
       </w:r>
     </w:p>
     <w:p>
-      <w:pPr>
-        <w:rPr>
-          <w:b/>
-          <w:bCs/>
-        </w:rPr>
-      </w:pPr>
-      <w:r>
-        <w:rPr>
-          <w:b/>
-          <w:bCs/>
-        </w:rPr>
+      <w:r>
         <w:t xml:space="preserve">El presente proyecto surge de la necesidad de modernizar y centralizar la gestión operativa de una </w:t>
       </w:r>
       <w:proofErr w:type="spellStart"/>
       <w:r>
-        <w:rPr>
-          <w:b/>
-          <w:bCs/>
-        </w:rPr>
         <w:t>PyME</w:t>
       </w:r>
       <w:proofErr w:type="spellEnd"/>
       <w:r>
-        <w:rPr>
-          <w:b/>
-          <w:bCs/>
-        </w:rPr>
         <w:t xml:space="preserve"> dedicada a la fabricación y comercialización de productos de acero inoxidable. La naturaleza mixta del negocio (venta de stock y producción a pedido) requiere un control preciso que los sistemas genéricos no suelen cubrir eficientemente.</w:t>
       </w:r>
     </w:p>
@@ -79,17 +61,7 @@
       </w:r>
     </w:p>
     <w:p>
-      <w:pPr>
-        <w:rPr>
-          <w:b/>
-          <w:bCs/>
-        </w:rPr>
-      </w:pPr>
-      <w:r>
-        <w:rPr>
-          <w:b/>
-          <w:bCs/>
-        </w:rPr>
+      <w:r>
         <w:t>Desarrollar e implementar un software de gestión robusto que integre todas las áreas funcionales de la empresa, permitiendo la trazabilidad total desde la adquisición de la materia prima hasta la entrega del producto terminado, optimizando los tiempos de producción y mejorando la toma de decisiones mediante reportes precisos.</w:t>
       </w:r>
     </w:p>
@@ -109,35 +81,8 @@
       </w:r>
     </w:p>
     <w:p>
-      <w:pPr>
-        <w:rPr>
-          <w:b/>
-          <w:bCs/>
-        </w:rPr>
-      </w:pPr>
-      <w:r>
-        <w:rPr>
-          <w:b/>
-          <w:bCs/>
-        </w:rPr>
+      <w:r>
         <w:t>El sistema abarcará la gestión de inventarios (materia prima y productos), el ciclo de ventas y marketing, el proceso de fabricación a medida, la logística de distribución, la facturación y la administración de cuentas con proveedores y clientes. Se limitará a un entorno de ejecución de escritorio para asegurar la operatividad local.</w:t>
-      </w:r>
-    </w:p>
-    <w:p>
-      <w:pPr>
-        <w:rPr>
-          <w:b/>
-          <w:bCs/>
-        </w:rPr>
-      </w:pPr>
-      <w:r>
-        <w:rPr>
-          <w:b/>
-          <w:bCs/>
-        </w:rPr>
-        <w:pict w14:anchorId="51D0CB01">
-          <v:rect id="_x0000_i1097" style="width:0;height:1.5pt" o:hralign="center" o:hrstd="t" o:hr="t" fillcolor="#a0a0a0" stroked="f"/>
-        </w:pict>
       </w:r>
     </w:p>
     <w:p>
@@ -174,118 +119,131 @@
       <w:pPr>
         <w:numPr>
           <w:ilvl w:val="0"/>
-          <w:numId w:val="13"/>
+          <w:numId w:val="17"/>
         </w:numPr>
+      </w:pPr>
+      <w:r>
         <w:rPr>
           <w:b/>
           <w:bCs/>
         </w:rPr>
+        <w:t>Gestión de Catálogo:</w:t>
+      </w:r>
+      <w:r>
+        <w:t xml:space="preserve"> Exhibición y administración de productos estándar y materiales base.</w:t>
+      </w:r>
+    </w:p>
+    <w:p>
+      <w:pPr>
+        <w:numPr>
+          <w:ilvl w:val="0"/>
+          <w:numId w:val="17"/>
+        </w:numPr>
       </w:pPr>
       <w:r>
         <w:rPr>
           <w:b/>
           <w:bCs/>
         </w:rPr>
-        <w:t>Gestión de Catálogo: Exhibición y administración de productos estándar y materiales base.</w:t>
+        <w:t>Gestión de Producción:</w:t>
+      </w:r>
+      <w:r>
+        <w:t xml:space="preserve"> Transformación de insumos en productos terminados bajo pedidos específicos.</w:t>
       </w:r>
     </w:p>
     <w:p>
       <w:pPr>
         <w:numPr>
           <w:ilvl w:val="0"/>
-          <w:numId w:val="13"/>
+          <w:numId w:val="17"/>
         </w:numPr>
+      </w:pPr>
+      <w:r>
         <w:rPr>
           <w:b/>
           <w:bCs/>
         </w:rPr>
+        <w:t>Control de Stock:</w:t>
+      </w:r>
+      <w:r>
+        <w:t xml:space="preserve"> Seguimiento de entradas y salidas en depósito (materia prima y productos terminados).</w:t>
+      </w:r>
+    </w:p>
+    <w:p>
+      <w:pPr>
+        <w:numPr>
+          <w:ilvl w:val="0"/>
+          <w:numId w:val="17"/>
+        </w:numPr>
       </w:pPr>
       <w:r>
         <w:rPr>
           <w:b/>
           <w:bCs/>
         </w:rPr>
-        <w:t>Gestión de Producción: Transformación de insumos en productos terminados bajo pedidos específicos.</w:t>
+        <w:t>Logística y Envíos:</w:t>
+      </w:r>
+      <w:r>
+        <w:t xml:space="preserve"> Coordinación de entregas según la preferencia del comprador.</w:t>
       </w:r>
     </w:p>
     <w:p>
       <w:pPr>
         <w:numPr>
           <w:ilvl w:val="0"/>
-          <w:numId w:val="13"/>
+          <w:numId w:val="17"/>
         </w:numPr>
+      </w:pPr>
+      <w:r>
         <w:rPr>
           <w:b/>
           <w:bCs/>
         </w:rPr>
-      </w:pPr>
-      <w:r>
+        <w:t>Módulo Administrativo:</w:t>
+      </w:r>
+      <w:r>
+        <w:t xml:space="preserve"> Facturación, gestión de pagos (proveedores/clientes) y reportes gerenciales.</w:t>
+      </w:r>
+    </w:p>
+    <w:p>
+      <w:pPr>
         <w:rPr>
           <w:b/>
           <w:bCs/>
         </w:rPr>
-        <w:t>Control de Stock: Seguimiento de entradas y salidas en depósito (materia prima y productos terminados).</w:t>
-      </w:r>
-    </w:p>
-    <w:p>
-      <w:pPr>
-        <w:numPr>
-          <w:ilvl w:val="0"/>
-          <w:numId w:val="13"/>
-        </w:numPr>
+      </w:pPr>
+      <w:r>
         <w:rPr>
           <w:b/>
           <w:bCs/>
         </w:rPr>
+        <w:t>2.2 Características del Usuario</w:t>
+      </w:r>
+    </w:p>
+    <w:p>
+      <w:pPr>
+        <w:numPr>
+          <w:ilvl w:val="0"/>
+          <w:numId w:val="18"/>
+        </w:numPr>
       </w:pPr>
       <w:r>
         <w:rPr>
           <w:b/>
           <w:bCs/>
         </w:rPr>
-        <w:t>Logística y Envíos: Coordinación de entregas según la preferencia del comprador.</w:t>
+        <w:t>Administrador:</w:t>
+      </w:r>
+      <w:r>
+        <w:t xml:space="preserve"> Acceso total, configuración de reglas de negocio y visualización de informes críticos.</w:t>
       </w:r>
     </w:p>
     <w:p>
       <w:pPr>
         <w:numPr>
           <w:ilvl w:val="0"/>
-          <w:numId w:val="13"/>
+          <w:numId w:val="18"/>
         </w:numPr>
-        <w:rPr>
-          <w:b/>
-          <w:bCs/>
-        </w:rPr>
-      </w:pPr>
-      <w:r>
-        <w:rPr>
-          <w:b/>
-          <w:bCs/>
-        </w:rPr>
-        <w:t>Módulo Administrativo: Facturación, gestión de pagos y reportes gerenciales.</w:t>
-      </w:r>
-    </w:p>
-    <w:p>
-      <w:pPr>
-        <w:rPr>
-          <w:b/>
-          <w:bCs/>
-        </w:rPr>
-      </w:pPr>
-      <w:r>
-        <w:rPr>
-          <w:b/>
-          <w:bCs/>
-        </w:rPr>
-        <w:br w:type="page"/>
-      </w:r>
-    </w:p>
-    <w:p>
-      <w:pPr>
-        <w:rPr>
-          <w:b/>
-          <w:bCs/>
-        </w:rPr>
       </w:pPr>
       <w:r>
         <w:rPr>
@@ -293,81 +251,28 @@
           <w:bCs/>
         </w:rPr>
         <w:lastRenderedPageBreak/>
-        <w:t>2.2 Características del Usuario</w:t>
+        <w:t>Vendedor:</w:t>
+      </w:r>
+      <w:r>
+        <w:t xml:space="preserve"> Gestión de clientes, carga de pedidos y consulta de catálogo/presupuestos.</w:t>
       </w:r>
     </w:p>
     <w:p>
       <w:pPr>
         <w:numPr>
           <w:ilvl w:val="0"/>
-          <w:numId w:val="14"/>
+          <w:numId w:val="18"/>
         </w:numPr>
+      </w:pPr>
+      <w:r>
         <w:rPr>
           <w:b/>
           <w:bCs/>
         </w:rPr>
-      </w:pPr>
-      <w:r>
-        <w:rPr>
-          <w:b/>
-          <w:bCs/>
-        </w:rPr>
-        <w:t>Administrador: Acceso total, configuración de reglas de negocio y visualización de informes críticos.</w:t>
-      </w:r>
-    </w:p>
-    <w:p>
-      <w:pPr>
-        <w:numPr>
-          <w:ilvl w:val="0"/>
-          <w:numId w:val="14"/>
-        </w:numPr>
-        <w:rPr>
-          <w:b/>
-          <w:bCs/>
-        </w:rPr>
-      </w:pPr>
-      <w:r>
-        <w:rPr>
-          <w:b/>
-          <w:bCs/>
-        </w:rPr>
-        <w:t>Vendedor: Gestión de clientes, carga de pedidos y catálogo.</w:t>
-      </w:r>
-    </w:p>
-    <w:p>
-      <w:pPr>
-        <w:numPr>
-          <w:ilvl w:val="0"/>
-          <w:numId w:val="14"/>
-        </w:numPr>
-        <w:rPr>
-          <w:b/>
-          <w:bCs/>
-        </w:rPr>
-      </w:pPr>
-      <w:r>
-        <w:rPr>
-          <w:b/>
-          <w:bCs/>
-        </w:rPr>
-        <w:t>Responsable de Depósito/Producción: Actualización de stock de materia prima y cambio de estados en las órdenes de fabricación.</w:t>
-      </w:r>
-    </w:p>
-    <w:p>
-      <w:pPr>
-        <w:rPr>
-          <w:b/>
-          <w:bCs/>
-        </w:rPr>
-      </w:pPr>
-      <w:r>
-        <w:rPr>
-          <w:b/>
-          <w:bCs/>
-        </w:rPr>
-        <w:pict w14:anchorId="5208BE27">
-          <v:rect id="_x0000_i1098" style="width:0;height:1.5pt" o:hralign="center" o:hrstd="t" o:hr="t" fillcolor="#a0a0a0" stroked="f"/>
-        </w:pict>
+        <w:t>Responsable de Depósito/Producción:</w:t>
+      </w:r>
+      <w:r>
+        <w:t xml:space="preserve"> Actualización de stock de materia prima y cambio de estados en las órdenes de fabricación y logística.</w:t>
       </w:r>
     </w:p>
     <w:p>
@@ -398,6 +303,602 @@
           <w:bCs/>
         </w:rPr>
         <w:t>3.1 Requerimientos Funcionales (RF)</w:t>
+      </w:r>
+    </w:p>
+    <w:p>
+      <w:r>
+        <w:rPr>
+          <w:i/>
+          <w:iCs/>
+        </w:rPr>
+        <w:t>Nota: Los requerimientos funcionales han sido derivados directamente de los flujos de procesos de negocio (BPM).</w:t>
+      </w:r>
+    </w:p>
+    <w:p>
+      <w:r>
+        <w:rPr>
+          <w:b/>
+          <w:bCs/>
+        </w:rPr>
+        <w:t>1. Módulo: Gestión de Catálogo (Maestro de Datos)</w:t>
+      </w:r>
+    </w:p>
+    <w:p>
+      <w:pPr>
+        <w:numPr>
+          <w:ilvl w:val="0"/>
+          <w:numId w:val="19"/>
+        </w:numPr>
+      </w:pPr>
+      <w:r>
+        <w:rPr>
+          <w:b/>
+          <w:bCs/>
+        </w:rPr>
+        <w:t>REQ.CATA.001 - Alta de Producto/Material:</w:t>
+      </w:r>
+      <w:r>
+        <w:t xml:space="preserve"> El sistema debe permitir el registro de nuevos ítems (insumos como chapas AISI 304/316 o productos terminados).</w:t>
+      </w:r>
+    </w:p>
+    <w:p>
+      <w:pPr>
+        <w:numPr>
+          <w:ilvl w:val="0"/>
+          <w:numId w:val="19"/>
+        </w:numPr>
+      </w:pPr>
+      <w:r>
+        <w:rPr>
+          <w:b/>
+          <w:bCs/>
+        </w:rPr>
+        <w:t>REQ.CATA.002 - Definición de Atributos Técnicos:</w:t>
+      </w:r>
+      <w:r>
+        <w:t xml:space="preserve"> El sistema debe permitir cargar especificaciones técnicas (espesor, acabado, tipo de acero, medidas estándar).</w:t>
+      </w:r>
+    </w:p>
+    <w:p>
+      <w:pPr>
+        <w:numPr>
+          <w:ilvl w:val="0"/>
+          <w:numId w:val="19"/>
+        </w:numPr>
+      </w:pPr>
+      <w:r>
+        <w:rPr>
+          <w:b/>
+          <w:bCs/>
+        </w:rPr>
+        <w:t>REQ.CATA.003 - Modificación Masiva de Precios:</w:t>
+      </w:r>
+      <w:r>
+        <w:t xml:space="preserve"> El sistema debe permitir actualizar los precios de venta de forma masiva según categorías o tipos de material.</w:t>
+      </w:r>
+    </w:p>
+    <w:p>
+      <w:pPr>
+        <w:numPr>
+          <w:ilvl w:val="0"/>
+          <w:numId w:val="19"/>
+        </w:numPr>
+      </w:pPr>
+      <w:r>
+        <w:rPr>
+          <w:b/>
+          <w:bCs/>
+        </w:rPr>
+        <w:t>REQ.CATA.004 - Identificación de Faltantes:</w:t>
+      </w:r>
+      <w:r>
+        <w:t xml:space="preserve"> El sistema debe marcar automáticamente como "Sin Stock" o "Faltante" aquellos ítems sin existencia física reportada.</w:t>
+      </w:r>
+    </w:p>
+    <w:p>
+      <w:pPr>
+        <w:numPr>
+          <w:ilvl w:val="0"/>
+          <w:numId w:val="19"/>
+        </w:numPr>
+      </w:pPr>
+      <w:r>
+        <w:rPr>
+          <w:b/>
+          <w:bCs/>
+        </w:rPr>
+        <w:t>REQ.CATA.005 - Gestión de Imágenes/Planos:</w:t>
+      </w:r>
+      <w:r>
+        <w:t xml:space="preserve"> El sistema debe permitir asociar una imagen o plano técnico a cada ítem del catálogo.</w:t>
+      </w:r>
+    </w:p>
+    <w:p>
+      <w:r>
+        <w:rPr>
+          <w:b/>
+          <w:bCs/>
+        </w:rPr>
+        <w:t>2. Módulo: Gestión de Ventas y Clientes</w:t>
+      </w:r>
+    </w:p>
+    <w:p>
+      <w:pPr>
+        <w:numPr>
+          <w:ilvl w:val="0"/>
+          <w:numId w:val="20"/>
+        </w:numPr>
+      </w:pPr>
+      <w:r>
+        <w:rPr>
+          <w:b/>
+          <w:bCs/>
+        </w:rPr>
+        <w:t>REQ.VENT.001 - Alta de Pedido (Stock/Medida):</w:t>
+      </w:r>
+      <w:r>
+        <w:t xml:space="preserve"> El sistema debe permitir cargar pedidos de productos estándar o configuraciones "A medida".</w:t>
+      </w:r>
+    </w:p>
+    <w:p>
+      <w:pPr>
+        <w:numPr>
+          <w:ilvl w:val="0"/>
+          <w:numId w:val="20"/>
+        </w:numPr>
+      </w:pPr>
+      <w:r>
+        <w:rPr>
+          <w:b/>
+          <w:bCs/>
+        </w:rPr>
+        <w:t>REQ.VENT.002 - Validación de Crédito de Cliente:</w:t>
+      </w:r>
+      <w:r>
+        <w:t xml:space="preserve"> Antes de confirmar la venta, el sistema debe verificar el estado crediticio del cliente y bloquear la operación si supera el límite de deuda.</w:t>
+      </w:r>
+    </w:p>
+    <w:p>
+      <w:pPr>
+        <w:numPr>
+          <w:ilvl w:val="0"/>
+          <w:numId w:val="20"/>
+        </w:numPr>
+      </w:pPr>
+      <w:r>
+        <w:rPr>
+          <w:b/>
+          <w:bCs/>
+        </w:rPr>
+        <w:t>REQ.VENT.003 - Generación de Factura:</w:t>
+      </w:r>
+      <w:r>
+        <w:t xml:space="preserve"> El sistema debe emitir comprobantes fiscales (A/B/C) una vez aprobado el pedido.</w:t>
+      </w:r>
+    </w:p>
+    <w:p>
+      <w:pPr>
+        <w:numPr>
+          <w:ilvl w:val="0"/>
+          <w:numId w:val="20"/>
+        </w:numPr>
+      </w:pPr>
+      <w:r>
+        <w:rPr>
+          <w:b/>
+          <w:bCs/>
+        </w:rPr>
+        <w:t>REQ.VENT.004 - Seguimiento de Estado:</w:t>
+      </w:r>
+      <w:r>
+        <w:t xml:space="preserve"> El sistema debe permitir visualizar en qué etapa se encuentra el pedido (Venta, Producción, Logística).</w:t>
+      </w:r>
+    </w:p>
+    <w:p>
+      <w:pPr>
+        <w:numPr>
+          <w:ilvl w:val="0"/>
+          <w:numId w:val="20"/>
+        </w:numPr>
+      </w:pPr>
+      <w:r>
+        <w:lastRenderedPageBreak/>
+        <w:t xml:space="preserve">REQ.VENT.005 - </w:t>
+      </w:r>
+      <w:proofErr w:type="spellStart"/>
+      <w:r>
+        <w:t>Gestion</w:t>
+      </w:r>
+      <w:proofErr w:type="spellEnd"/>
+      <w:r>
+        <w:t xml:space="preserve"> de Datos de Cliente</w:t>
+      </w:r>
+      <w:r>
+        <w:t xml:space="preserve">: </w:t>
+      </w:r>
+      <w:r>
+        <w:t>El sistema debe permitir administrar el ABM (Alta, Baja, Modificación) de clientes, incluyendo CUIT, Razón Social y Direcciones de Entrega.</w:t>
+      </w:r>
+    </w:p>
+    <w:p>
+      <w:pPr>
+        <w:ind w:left="720"/>
+      </w:pPr>
+    </w:p>
+    <w:p>
+      <w:r>
+        <w:rPr>
+          <w:b/>
+          <w:bCs/>
+        </w:rPr>
+        <w:t>3. Módulo: Gestión de Producción</w:t>
+      </w:r>
+    </w:p>
+    <w:p>
+      <w:pPr>
+        <w:numPr>
+          <w:ilvl w:val="0"/>
+          <w:numId w:val="21"/>
+        </w:numPr>
+      </w:pPr>
+      <w:r>
+        <w:rPr>
+          <w:b/>
+          <w:bCs/>
+        </w:rPr>
+        <w:t>REQ.PROD.001 - Emisión de Orden de Trabajo (OT):</w:t>
+      </w:r>
+      <w:r>
+        <w:t xml:space="preserve"> El sistema debe generar automáticamente una OT con el plano técnico para pedidos "A medida".</w:t>
+      </w:r>
+    </w:p>
+    <w:p>
+      <w:pPr>
+        <w:numPr>
+          <w:ilvl w:val="0"/>
+          <w:numId w:val="21"/>
+        </w:numPr>
+      </w:pPr>
+      <w:r>
+        <w:rPr>
+          <w:b/>
+          <w:bCs/>
+        </w:rPr>
+        <w:t>REQ.PROD.002 - Reserva de Insumos:</w:t>
+      </w:r>
+      <w:r>
+        <w:t xml:space="preserve"> El sistema debe descontar del stock disponible los materiales necesarios (chapas, caños) al iniciar una producción.</w:t>
+      </w:r>
+    </w:p>
+    <w:p>
+      <w:pPr>
+        <w:numPr>
+          <w:ilvl w:val="0"/>
+          <w:numId w:val="21"/>
+        </w:numPr>
+      </w:pPr>
+      <w:r>
+        <w:rPr>
+          <w:b/>
+          <w:bCs/>
+        </w:rPr>
+        <w:t>REQ.PROD.003 - Registro de Control de Calidad:</w:t>
+      </w:r>
+      <w:r>
+        <w:t xml:space="preserve"> El sistema debe permitir registrar si una pieza fue "Aprobada" o requiere "</w:t>
+      </w:r>
+      <w:proofErr w:type="spellStart"/>
+      <w:r>
+        <w:t>Re-proceso</w:t>
+      </w:r>
+      <w:proofErr w:type="spellEnd"/>
+      <w:r>
+        <w:t>".</w:t>
+      </w:r>
+    </w:p>
+    <w:p>
+      <w:pPr>
+        <w:numPr>
+          <w:ilvl w:val="0"/>
+          <w:numId w:val="21"/>
+        </w:numPr>
+      </w:pPr>
+      <w:r>
+        <w:rPr>
+          <w:b/>
+          <w:bCs/>
+        </w:rPr>
+        <w:t>REQ.PROD.004 - Notificación de Finalización:</w:t>
+      </w:r>
+      <w:r>
+        <w:t xml:space="preserve"> Al terminar la fabricación, el sistema debe cambiar el estado del pedido a finalizado.</w:t>
+      </w:r>
+    </w:p>
+    <w:p>
+      <w:r>
+        <w:rPr>
+          <w:b/>
+          <w:bCs/>
+        </w:rPr>
+        <w:t>4. Módulo: Logística y Distribución</w:t>
+      </w:r>
+    </w:p>
+    <w:p>
+      <w:pPr>
+        <w:numPr>
+          <w:ilvl w:val="0"/>
+          <w:numId w:val="22"/>
+        </w:numPr>
+      </w:pPr>
+      <w:r>
+        <w:rPr>
+          <w:b/>
+          <w:bCs/>
+        </w:rPr>
+        <w:t>REQ.LOGI.001 - Generación de Hoja de Ruta:</w:t>
+      </w:r>
+      <w:r>
+        <w:t xml:space="preserve"> El sistema debe agrupar pedidos listos y asignar vehículos para el despacho.</w:t>
+      </w:r>
+    </w:p>
+    <w:p>
+      <w:pPr>
+        <w:numPr>
+          <w:ilvl w:val="0"/>
+          <w:numId w:val="22"/>
+        </w:numPr>
+      </w:pPr>
+      <w:r>
+        <w:rPr>
+          <w:b/>
+          <w:bCs/>
+        </w:rPr>
+        <w:t>REQ.LOGI.002 - Registro de Entrega/Rechazo:</w:t>
+      </w:r>
+      <w:r>
+        <w:t xml:space="preserve"> El sistema debe permitir registrar la recepción conforme o el rechazo (indicando motivo).</w:t>
+      </w:r>
+    </w:p>
+    <w:p>
+      <w:pPr>
+        <w:numPr>
+          <w:ilvl w:val="0"/>
+          <w:numId w:val="22"/>
+        </w:numPr>
+      </w:pPr>
+      <w:r>
+        <w:rPr>
+          <w:b/>
+          <w:bCs/>
+        </w:rPr>
+        <w:t>REQ.LOGI.003 - Gestión de Logística Inversa:</w:t>
+      </w:r>
+      <w:r>
+        <w:t xml:space="preserve"> Ante un rechazo, el sistema debe permitir registrar el </w:t>
+      </w:r>
+      <w:proofErr w:type="spellStart"/>
+      <w:r>
+        <w:t>re-ingreso</w:t>
+      </w:r>
+      <w:proofErr w:type="spellEnd"/>
+      <w:r>
+        <w:t xml:space="preserve"> del material al depósito.</w:t>
+      </w:r>
+    </w:p>
+    <w:p>
+      <w:r>
+        <w:rPr>
+          <w:b/>
+          <w:bCs/>
+        </w:rPr>
+        <w:t>5. Módulo: Compras y Proveedores</w:t>
+      </w:r>
+    </w:p>
+    <w:p>
+      <w:pPr>
+        <w:numPr>
+          <w:ilvl w:val="0"/>
+          <w:numId w:val="23"/>
+        </w:numPr>
+      </w:pPr>
+      <w:r>
+        <w:rPr>
+          <w:b/>
+          <w:bCs/>
+        </w:rPr>
+        <w:t>REQ.COMP.001 - Generación de Requerimiento:</w:t>
+      </w:r>
+      <w:r>
+        <w:t xml:space="preserve"> El sistema debe sugerir compras basándose en faltantes del catálogo.</w:t>
+      </w:r>
+    </w:p>
+    <w:p>
+      <w:pPr>
+        <w:numPr>
+          <w:ilvl w:val="0"/>
+          <w:numId w:val="23"/>
+        </w:numPr>
+      </w:pPr>
+      <w:r>
+        <w:rPr>
+          <w:b/>
+          <w:bCs/>
+        </w:rPr>
+        <w:t>REQ.COMP.002 - Emisión de Orden de Compra:</w:t>
+      </w:r>
+      <w:r>
+        <w:t xml:space="preserve"> El sistema debe permitir enviar formalmente el pedido de materiales.</w:t>
+      </w:r>
+    </w:p>
+    <w:p>
+      <w:pPr>
+        <w:numPr>
+          <w:ilvl w:val="0"/>
+          <w:numId w:val="23"/>
+        </w:numPr>
+      </w:pPr>
+      <w:r>
+        <w:rPr>
+          <w:b/>
+          <w:bCs/>
+        </w:rPr>
+        <w:t>REQ.COMP.003 - Control de Recepción:</w:t>
+      </w:r>
+      <w:r>
+        <w:t xml:space="preserve"> El sistema debe permitir validar que el material ingresado coincida con la Orden de Compra.</w:t>
+      </w:r>
+    </w:p>
+    <w:p>
+      <w:pPr>
+        <w:numPr>
+          <w:ilvl w:val="0"/>
+          <w:numId w:val="23"/>
+        </w:numPr>
+      </w:pPr>
+      <w:r>
+        <w:t xml:space="preserve">REQ.COMP.004 </w:t>
+      </w:r>
+      <w:proofErr w:type="gramStart"/>
+      <w:r>
+        <w:t>-  Registro</w:t>
+      </w:r>
+      <w:proofErr w:type="gramEnd"/>
+      <w:r>
+        <w:t xml:space="preserve"> de Proveedores</w:t>
+      </w:r>
+      <w:r>
+        <w:t xml:space="preserve">: </w:t>
+      </w:r>
+      <w:r>
+        <w:t>El sistema debe contar con un maestro de proveedores para almacenar datos de contacto, CUIT y plazos de entrega acordados</w:t>
+      </w:r>
+    </w:p>
+    <w:p>
+      <w:pPr>
+        <w:ind w:left="720"/>
+      </w:pPr>
+    </w:p>
+    <w:p>
+      <w:r>
+        <w:rPr>
+          <w:b/>
+          <w:bCs/>
+        </w:rPr>
+        <w:lastRenderedPageBreak/>
+        <w:t>6. Módulo: Finanzas y Pagos</w:t>
+      </w:r>
+    </w:p>
+    <w:p>
+      <w:pPr>
+        <w:numPr>
+          <w:ilvl w:val="0"/>
+          <w:numId w:val="24"/>
+        </w:numPr>
+      </w:pPr>
+      <w:r>
+        <w:rPr>
+          <w:b/>
+          <w:bCs/>
+        </w:rPr>
+        <w:t>REQ.FINA.001 - Consulta de Estado Crediticio:</w:t>
+      </w:r>
+      <w:r>
+        <w:t xml:space="preserve"> El sistema debe mostrar el saldo adeudado a proveedores.</w:t>
+      </w:r>
+    </w:p>
+    <w:p>
+      <w:pPr>
+        <w:numPr>
+          <w:ilvl w:val="0"/>
+          <w:numId w:val="24"/>
+        </w:numPr>
+      </w:pPr>
+      <w:r>
+        <w:rPr>
+          <w:b/>
+          <w:bCs/>
+        </w:rPr>
+        <w:t>REQ.FINA.002 - Emisión de Orden de Pago:</w:t>
+      </w:r>
+      <w:r>
+        <w:t xml:space="preserve"> El sistema debe permitir registrar pagos realizados.</w:t>
+      </w:r>
+      <w:r>
+        <w:rPr>
+          <w:rFonts w:ascii="Aptos" w:eastAsia="Times New Roman" w:hAnsi="Aptos" w:cs="Calibri"/>
+          <w:color w:val="000000"/>
+          <w:kern w:val="0"/>
+        </w:rPr>
+        <w:t xml:space="preserve"> </w:t>
+      </w:r>
+      <w:r>
+        <w:t>La funcionalidad para seleccionar medios de pago (E-</w:t>
+      </w:r>
+      <w:proofErr w:type="spellStart"/>
+      <w:r>
+        <w:t>check</w:t>
+      </w:r>
+      <w:proofErr w:type="spellEnd"/>
+      <w:r>
+        <w:t>, transferencia, etc.).</w:t>
+      </w:r>
+    </w:p>
+    <w:p>
+      <w:pPr>
+        <w:numPr>
+          <w:ilvl w:val="0"/>
+          <w:numId w:val="24"/>
+        </w:numPr>
+      </w:pPr>
+      <w:r>
+        <w:rPr>
+          <w:b/>
+          <w:bCs/>
+        </w:rPr>
+        <w:t>REQ.FINA.003 - Sincronización Contable:</w:t>
+      </w:r>
+      <w:r>
+        <w:t xml:space="preserve"> Al realizar un pago, actualizar la cuenta corriente y libro de bancos.</w:t>
+      </w:r>
+    </w:p>
+    <w:p>
+      <w:pPr>
+        <w:numPr>
+          <w:ilvl w:val="0"/>
+          <w:numId w:val="24"/>
+        </w:numPr>
+      </w:pPr>
+      <w:r>
+        <w:t xml:space="preserve">REQ.FINA.004 - </w:t>
+      </w:r>
+      <w:proofErr w:type="spellStart"/>
+      <w:r>
+        <w:t>Gestion</w:t>
+      </w:r>
+      <w:proofErr w:type="spellEnd"/>
+      <w:r>
+        <w:t xml:space="preserve"> de Cuenta Corriente</w:t>
+      </w:r>
+      <w:r>
+        <w:t xml:space="preserve">: </w:t>
+      </w:r>
+      <w:r>
+        <w:t>Permite ver el historial de movimientos y saldos con cada proveedor de acero.</w:t>
+      </w:r>
+    </w:p>
+    <w:p>
+      <w:pPr>
+        <w:rPr>
+          <w:b/>
+          <w:bCs/>
+        </w:rPr>
+      </w:pPr>
+      <w:r>
+        <w:rPr>
+          <w:b/>
+          <w:bCs/>
+        </w:rPr>
+        <w:t>3.2 Requerimientos No Funcionales (RNF)</w:t>
       </w:r>
     </w:p>
     <w:tbl>
@@ -405,22 +906,19 @@
         <w:tblW w:w="0" w:type="auto"/>
         <w:tblCellSpacing w:w="15" w:type="dxa"/>
         <w:tblCellMar>
-          <w:top w:w="15" w:type="dxa"/>
-          <w:left w:w="15" w:type="dxa"/>
-          <w:bottom w:w="15" w:type="dxa"/>
-          <w:right w:w="15" w:type="dxa"/>
+          <w:left w:w="0" w:type="dxa"/>
+          <w:right w:w="0" w:type="dxa"/>
         </w:tblCellMar>
         <w:tblLook w:val="04A0" w:firstRow="1" w:lastRow="0" w:firstColumn="1" w:lastColumn="0" w:noHBand="0" w:noVBand="1"/>
       </w:tblPr>
       <w:tblGrid>
-        <w:gridCol w:w="508"/>
-        <w:gridCol w:w="2407"/>
-        <w:gridCol w:w="1091"/>
-        <w:gridCol w:w="4482"/>
+        <w:gridCol w:w="995"/>
+        <w:gridCol w:w="2286"/>
+        <w:gridCol w:w="1421"/>
+        <w:gridCol w:w="3786"/>
       </w:tblGrid>
       <w:tr>
         <w:trPr>
-          <w:tblHeader/>
           <w:tblCellSpacing w:w="15" w:type="dxa"/>
         </w:trPr>
         <w:tc>
@@ -432,16 +930,16 @@
               <w:bottom w:val="single" w:sz="6" w:space="0" w:color="auto"/>
               <w:right w:val="single" w:sz="6" w:space="0" w:color="auto"/>
             </w:tcBorders>
+            <w:tcMar>
+              <w:top w:w="120" w:type="dxa"/>
+              <w:left w:w="180" w:type="dxa"/>
+              <w:bottom w:w="120" w:type="dxa"/>
+              <w:right w:w="180" w:type="dxa"/>
+            </w:tcMar>
             <w:vAlign w:val="center"/>
             <w:hideMark/>
           </w:tcPr>
           <w:p>
-            <w:pPr>
-              <w:rPr>
-                <w:b/>
-                <w:bCs/>
-              </w:rPr>
-            </w:pPr>
             <w:r>
               <w:rPr>
                 <w:b/>
@@ -460,16 +958,16 @@
               <w:bottom w:val="single" w:sz="6" w:space="0" w:color="auto"/>
               <w:right w:val="single" w:sz="6" w:space="0" w:color="auto"/>
             </w:tcBorders>
+            <w:tcMar>
+              <w:top w:w="120" w:type="dxa"/>
+              <w:left w:w="180" w:type="dxa"/>
+              <w:bottom w:w="120" w:type="dxa"/>
+              <w:right w:w="180" w:type="dxa"/>
+            </w:tcMar>
             <w:vAlign w:val="center"/>
             <w:hideMark/>
           </w:tcPr>
           <w:p>
-            <w:pPr>
-              <w:rPr>
-                <w:b/>
-                <w:bCs/>
-              </w:rPr>
-            </w:pPr>
             <w:r>
               <w:rPr>
                 <w:b/>
@@ -488,16 +986,16 @@
               <w:bottom w:val="single" w:sz="6" w:space="0" w:color="auto"/>
               <w:right w:val="single" w:sz="6" w:space="0" w:color="auto"/>
             </w:tcBorders>
+            <w:tcMar>
+              <w:top w:w="120" w:type="dxa"/>
+              <w:left w:w="180" w:type="dxa"/>
+              <w:bottom w:w="120" w:type="dxa"/>
+              <w:right w:w="180" w:type="dxa"/>
+            </w:tcMar>
             <w:vAlign w:val="center"/>
             <w:hideMark/>
           </w:tcPr>
           <w:p>
-            <w:pPr>
-              <w:rPr>
-                <w:b/>
-                <w:bCs/>
-              </w:rPr>
-            </w:pPr>
             <w:r>
               <w:rPr>
                 <w:b/>
@@ -516,16 +1014,16 @@
               <w:bottom w:val="single" w:sz="6" w:space="0" w:color="auto"/>
               <w:right w:val="single" w:sz="6" w:space="0" w:color="auto"/>
             </w:tcBorders>
+            <w:tcMar>
+              <w:top w:w="120" w:type="dxa"/>
+              <w:left w:w="180" w:type="dxa"/>
+              <w:bottom w:w="120" w:type="dxa"/>
+              <w:right w:w="180" w:type="dxa"/>
+            </w:tcMar>
             <w:vAlign w:val="center"/>
             <w:hideMark/>
           </w:tcPr>
           <w:p>
-            <w:pPr>
-              <w:rPr>
-                <w:b/>
-                <w:bCs/>
-              </w:rPr>
-            </w:pPr>
             <w:r>
               <w:rPr>
                 <w:b/>
@@ -549,22 +1047,22 @@
               <w:bottom w:val="single" w:sz="6" w:space="0" w:color="auto"/>
               <w:right w:val="single" w:sz="6" w:space="0" w:color="auto"/>
             </w:tcBorders>
+            <w:tcMar>
+              <w:top w:w="120" w:type="dxa"/>
+              <w:left w:w="180" w:type="dxa"/>
+              <w:bottom w:w="120" w:type="dxa"/>
+              <w:right w:w="180" w:type="dxa"/>
+            </w:tcMar>
             <w:vAlign w:val="center"/>
             <w:hideMark/>
           </w:tcPr>
           <w:p>
-            <w:pPr>
-              <w:rPr>
-                <w:b/>
-                <w:bCs/>
-              </w:rPr>
-            </w:pPr>
             <w:r>
               <w:rPr>
                 <w:b/>
                 <w:bCs/>
               </w:rPr>
-              <w:t>RF-1</w:t>
+              <w:t>RNF-1</w:t>
             </w:r>
           </w:p>
         </w:tc>
@@ -577,22 +1075,18 @@
               <w:bottom w:val="single" w:sz="6" w:space="0" w:color="auto"/>
               <w:right w:val="single" w:sz="6" w:space="0" w:color="auto"/>
             </w:tcBorders>
+            <w:tcMar>
+              <w:top w:w="120" w:type="dxa"/>
+              <w:left w:w="180" w:type="dxa"/>
+              <w:bottom w:w="120" w:type="dxa"/>
+              <w:right w:w="180" w:type="dxa"/>
+            </w:tcMar>
             <w:vAlign w:val="center"/>
             <w:hideMark/>
           </w:tcPr>
           <w:p>
-            <w:pPr>
-              <w:rPr>
-                <w:b/>
-                <w:bCs/>
-              </w:rPr>
-            </w:pPr>
             <w:r>
-              <w:rPr>
-                <w:b/>
-                <w:bCs/>
-              </w:rPr>
-              <w:t>Gestión de Pedidos Especiales</w:t>
+              <w:t>Seguridad de Acceso</w:t>
             </w:r>
           </w:p>
         </w:tc>
@@ -605,21 +1099,17 @@
               <w:bottom w:val="single" w:sz="6" w:space="0" w:color="auto"/>
               <w:right w:val="single" w:sz="6" w:space="0" w:color="auto"/>
             </w:tcBorders>
+            <w:tcMar>
+              <w:top w:w="120" w:type="dxa"/>
+              <w:left w:w="180" w:type="dxa"/>
+              <w:bottom w:w="120" w:type="dxa"/>
+              <w:right w:w="180" w:type="dxa"/>
+            </w:tcMar>
             <w:vAlign w:val="center"/>
             <w:hideMark/>
           </w:tcPr>
           <w:p>
-            <w:pPr>
-              <w:rPr>
-                <w:b/>
-                <w:bCs/>
-              </w:rPr>
-            </w:pPr>
             <w:r>
-              <w:rPr>
-                <w:b/>
-                <w:bCs/>
-              </w:rPr>
               <w:t>Alta</w:t>
             </w:r>
           </w:p>
@@ -633,22 +1123,26 @@
               <w:bottom w:val="single" w:sz="6" w:space="0" w:color="auto"/>
               <w:right w:val="single" w:sz="6" w:space="0" w:color="auto"/>
             </w:tcBorders>
+            <w:tcMar>
+              <w:top w:w="120" w:type="dxa"/>
+              <w:left w:w="180" w:type="dxa"/>
+              <w:bottom w:w="120" w:type="dxa"/>
+              <w:right w:w="180" w:type="dxa"/>
+            </w:tcMar>
             <w:vAlign w:val="center"/>
             <w:hideMark/>
           </w:tcPr>
           <w:p>
-            <w:pPr>
-              <w:rPr>
-                <w:b/>
-                <w:bCs/>
-              </w:rPr>
-            </w:pPr>
             <w:r>
-              <w:rPr>
-                <w:b/>
-                <w:bCs/>
-              </w:rPr>
-              <w:t>El sistema debe permitir definir especificaciones técnicas para productos a pedido.</w:t>
+              <w:t>El acceso debe estar restringido por roles de usuario (</w:t>
+            </w:r>
+            <w:proofErr w:type="spellStart"/>
+            <w:r>
+              <w:t>Admin</w:t>
+            </w:r>
+            <w:proofErr w:type="spellEnd"/>
+            <w:r>
+              <w:t>, Vendedor, Depósito).</w:t>
             </w:r>
           </w:p>
         </w:tc>
@@ -666,22 +1160,22 @@
               <w:bottom w:val="single" w:sz="6" w:space="0" w:color="auto"/>
               <w:right w:val="single" w:sz="6" w:space="0" w:color="auto"/>
             </w:tcBorders>
+            <w:tcMar>
+              <w:top w:w="120" w:type="dxa"/>
+              <w:left w:w="180" w:type="dxa"/>
+              <w:bottom w:w="120" w:type="dxa"/>
+              <w:right w:w="180" w:type="dxa"/>
+            </w:tcMar>
             <w:vAlign w:val="center"/>
             <w:hideMark/>
           </w:tcPr>
           <w:p>
-            <w:pPr>
-              <w:rPr>
-                <w:b/>
-                <w:bCs/>
-              </w:rPr>
-            </w:pPr>
             <w:r>
               <w:rPr>
                 <w:b/>
                 <w:bCs/>
               </w:rPr>
-              <w:t>RF-2</w:t>
+              <w:t>RNF-2</w:t>
             </w:r>
           </w:p>
         </w:tc>
@@ -694,22 +1188,18 @@
               <w:bottom w:val="single" w:sz="6" w:space="0" w:color="auto"/>
               <w:right w:val="single" w:sz="6" w:space="0" w:color="auto"/>
             </w:tcBorders>
+            <w:tcMar>
+              <w:top w:w="120" w:type="dxa"/>
+              <w:left w:w="180" w:type="dxa"/>
+              <w:bottom w:w="120" w:type="dxa"/>
+              <w:right w:w="180" w:type="dxa"/>
+            </w:tcMar>
             <w:vAlign w:val="center"/>
             <w:hideMark/>
           </w:tcPr>
           <w:p>
-            <w:pPr>
-              <w:rPr>
-                <w:b/>
-                <w:bCs/>
-              </w:rPr>
-            </w:pPr>
             <w:r>
-              <w:rPr>
-                <w:b/>
-                <w:bCs/>
-              </w:rPr>
-              <w:t>Trazabilidad de Producción</w:t>
+              <w:t>Robustez de Datos</w:t>
             </w:r>
           </w:p>
         </w:tc>
@@ -722,21 +1212,17 @@
               <w:bottom w:val="single" w:sz="6" w:space="0" w:color="auto"/>
               <w:right w:val="single" w:sz="6" w:space="0" w:color="auto"/>
             </w:tcBorders>
+            <w:tcMar>
+              <w:top w:w="120" w:type="dxa"/>
+              <w:left w:w="180" w:type="dxa"/>
+              <w:bottom w:w="120" w:type="dxa"/>
+              <w:right w:w="180" w:type="dxa"/>
+            </w:tcMar>
             <w:vAlign w:val="center"/>
             <w:hideMark/>
           </w:tcPr>
           <w:p>
-            <w:pPr>
-              <w:rPr>
-                <w:b/>
-                <w:bCs/>
-              </w:rPr>
-            </w:pPr>
             <w:r>
-              <w:rPr>
-                <w:b/>
-                <w:bCs/>
-              </w:rPr>
               <w:t>Alta</w:t>
             </w:r>
           </w:p>
@@ -750,22 +1236,18 @@
               <w:bottom w:val="single" w:sz="6" w:space="0" w:color="auto"/>
               <w:right w:val="single" w:sz="6" w:space="0" w:color="auto"/>
             </w:tcBorders>
+            <w:tcMar>
+              <w:top w:w="120" w:type="dxa"/>
+              <w:left w:w="180" w:type="dxa"/>
+              <w:bottom w:w="120" w:type="dxa"/>
+              <w:right w:w="180" w:type="dxa"/>
+            </w:tcMar>
             <w:vAlign w:val="center"/>
             <w:hideMark/>
           </w:tcPr>
           <w:p>
-            <w:pPr>
-              <w:rPr>
-                <w:b/>
-                <w:bCs/>
-              </w:rPr>
-            </w:pPr>
             <w:r>
-              <w:rPr>
-                <w:b/>
-                <w:bCs/>
-              </w:rPr>
-              <w:t>Se debe poder rastrear en qué etapa (Corte, Soldadura, Pulido, etc.) está un producto.</w:t>
+              <w:t>El sistema debe manejar transacciones (ACID) para evitar inconsistencias en el stock.</w:t>
             </w:r>
           </w:p>
         </w:tc>
@@ -783,22 +1265,22 @@
               <w:bottom w:val="single" w:sz="6" w:space="0" w:color="auto"/>
               <w:right w:val="single" w:sz="6" w:space="0" w:color="auto"/>
             </w:tcBorders>
+            <w:tcMar>
+              <w:top w:w="120" w:type="dxa"/>
+              <w:left w:w="180" w:type="dxa"/>
+              <w:bottom w:w="120" w:type="dxa"/>
+              <w:right w:w="180" w:type="dxa"/>
+            </w:tcMar>
             <w:vAlign w:val="center"/>
             <w:hideMark/>
           </w:tcPr>
           <w:p>
-            <w:pPr>
-              <w:rPr>
-                <w:b/>
-                <w:bCs/>
-              </w:rPr>
-            </w:pPr>
             <w:r>
               <w:rPr>
                 <w:b/>
                 <w:bCs/>
               </w:rPr>
-              <w:t>RF-3</w:t>
+              <w:t>RNF-3</w:t>
             </w:r>
           </w:p>
         </w:tc>
@@ -811,22 +1293,18 @@
               <w:bottom w:val="single" w:sz="6" w:space="0" w:color="auto"/>
               <w:right w:val="single" w:sz="6" w:space="0" w:color="auto"/>
             </w:tcBorders>
+            <w:tcMar>
+              <w:top w:w="120" w:type="dxa"/>
+              <w:left w:w="180" w:type="dxa"/>
+              <w:bottom w:w="120" w:type="dxa"/>
+              <w:right w:w="180" w:type="dxa"/>
+            </w:tcMar>
             <w:vAlign w:val="center"/>
             <w:hideMark/>
           </w:tcPr>
           <w:p>
-            <w:pPr>
-              <w:rPr>
-                <w:b/>
-                <w:bCs/>
-              </w:rPr>
-            </w:pPr>
             <w:r>
-              <w:rPr>
-                <w:b/>
-                <w:bCs/>
-              </w:rPr>
-              <w:t>Gestión de Proveedores</w:t>
+              <w:t>Disponibilidad Local</w:t>
             </w:r>
           </w:p>
         </w:tc>
@@ -839,22 +1317,18 @@
               <w:bottom w:val="single" w:sz="6" w:space="0" w:color="auto"/>
               <w:right w:val="single" w:sz="6" w:space="0" w:color="auto"/>
             </w:tcBorders>
+            <w:tcMar>
+              <w:top w:w="120" w:type="dxa"/>
+              <w:left w:w="180" w:type="dxa"/>
+              <w:bottom w:w="120" w:type="dxa"/>
+              <w:right w:w="180" w:type="dxa"/>
+            </w:tcMar>
             <w:vAlign w:val="center"/>
             <w:hideMark/>
           </w:tcPr>
           <w:p>
-            <w:pPr>
-              <w:rPr>
-                <w:b/>
-                <w:bCs/>
-              </w:rPr>
-            </w:pPr>
             <w:r>
-              <w:rPr>
-                <w:b/>
-                <w:bCs/>
-              </w:rPr>
-              <w:t>Media</w:t>
+              <w:t>Alta</w:t>
             </w:r>
           </w:p>
         </w:tc>
@@ -867,22 +1341,18 @@
               <w:bottom w:val="single" w:sz="6" w:space="0" w:color="auto"/>
               <w:right w:val="single" w:sz="6" w:space="0" w:color="auto"/>
             </w:tcBorders>
+            <w:tcMar>
+              <w:top w:w="120" w:type="dxa"/>
+              <w:left w:w="180" w:type="dxa"/>
+              <w:bottom w:w="120" w:type="dxa"/>
+              <w:right w:w="180" w:type="dxa"/>
+            </w:tcMar>
             <w:vAlign w:val="center"/>
             <w:hideMark/>
           </w:tcPr>
           <w:p>
-            <w:pPr>
-              <w:rPr>
-                <w:b/>
-                <w:bCs/>
-              </w:rPr>
-            </w:pPr>
             <w:r>
-              <w:rPr>
-                <w:b/>
-                <w:bCs/>
-              </w:rPr>
-              <w:t>Registro de proveedores y seguimiento de deudas/pagos.</w:t>
+              <w:t>El software debe operar de forma autónoma en entorno de escritorio sin dependencia de internet constante.</w:t>
             </w:r>
           </w:p>
         </w:tc>
@@ -900,22 +1370,22 @@
               <w:bottom w:val="single" w:sz="6" w:space="0" w:color="auto"/>
               <w:right w:val="single" w:sz="6" w:space="0" w:color="auto"/>
             </w:tcBorders>
+            <w:tcMar>
+              <w:top w:w="120" w:type="dxa"/>
+              <w:left w:w="180" w:type="dxa"/>
+              <w:bottom w:w="120" w:type="dxa"/>
+              <w:right w:w="180" w:type="dxa"/>
+            </w:tcMar>
             <w:vAlign w:val="center"/>
             <w:hideMark/>
           </w:tcPr>
           <w:p>
-            <w:pPr>
-              <w:rPr>
-                <w:b/>
-                <w:bCs/>
-              </w:rPr>
-            </w:pPr>
             <w:r>
               <w:rPr>
                 <w:b/>
                 <w:bCs/>
               </w:rPr>
-              <w:t>RF-4</w:t>
+              <w:t>RNF-4</w:t>
             </w:r>
           </w:p>
         </w:tc>
@@ -928,22 +1398,18 @@
               <w:bottom w:val="single" w:sz="6" w:space="0" w:color="auto"/>
               <w:right w:val="single" w:sz="6" w:space="0" w:color="auto"/>
             </w:tcBorders>
+            <w:tcMar>
+              <w:top w:w="120" w:type="dxa"/>
+              <w:left w:w="180" w:type="dxa"/>
+              <w:bottom w:w="120" w:type="dxa"/>
+              <w:right w:w="180" w:type="dxa"/>
+            </w:tcMar>
             <w:vAlign w:val="center"/>
             <w:hideMark/>
           </w:tcPr>
           <w:p>
-            <w:pPr>
-              <w:rPr>
-                <w:b/>
-                <w:bCs/>
-              </w:rPr>
-            </w:pPr>
             <w:r>
-              <w:rPr>
-                <w:b/>
-                <w:bCs/>
-              </w:rPr>
-              <w:t>Emisión de Facturas</w:t>
+              <w:t>Persistencia</w:t>
             </w:r>
           </w:p>
         </w:tc>
@@ -956,21 +1422,17 @@
               <w:bottom w:val="single" w:sz="6" w:space="0" w:color="auto"/>
               <w:right w:val="single" w:sz="6" w:space="0" w:color="auto"/>
             </w:tcBorders>
+            <w:tcMar>
+              <w:top w:w="120" w:type="dxa"/>
+              <w:left w:w="180" w:type="dxa"/>
+              <w:bottom w:w="120" w:type="dxa"/>
+              <w:right w:w="180" w:type="dxa"/>
+            </w:tcMar>
             <w:vAlign w:val="center"/>
             <w:hideMark/>
           </w:tcPr>
           <w:p>
-            <w:pPr>
-              <w:rPr>
-                <w:b/>
-                <w:bCs/>
-              </w:rPr>
-            </w:pPr>
             <w:r>
-              <w:rPr>
-                <w:b/>
-                <w:bCs/>
-              </w:rPr>
               <w:t>Alta</w:t>
             </w:r>
           </w:p>
@@ -984,26 +1446,54 @@
               <w:bottom w:val="single" w:sz="6" w:space="0" w:color="auto"/>
               <w:right w:val="single" w:sz="6" w:space="0" w:color="auto"/>
             </w:tcBorders>
+            <w:tcMar>
+              <w:top w:w="120" w:type="dxa"/>
+              <w:left w:w="180" w:type="dxa"/>
+              <w:bottom w:w="120" w:type="dxa"/>
+              <w:right w:w="180" w:type="dxa"/>
+            </w:tcMar>
             <w:vAlign w:val="center"/>
             <w:hideMark/>
           </w:tcPr>
           <w:p>
-            <w:pPr>
-              <w:rPr>
-                <w:b/>
-                <w:bCs/>
-              </w:rPr>
-            </w:pPr>
             <w:r>
-              <w:rPr>
-                <w:b/>
-                <w:bCs/>
-              </w:rPr>
-              <w:t>Generación de comprobantes vinculados a pedidos de venta.</w:t>
+              <w:t>Uso de base de datos relacional para asegurar la integridad de los registros históricos.</w:t>
             </w:r>
           </w:p>
         </w:tc>
       </w:tr>
+    </w:tbl>
+    <w:p>
+      <w:pPr>
+        <w:rPr>
+          <w:b/>
+          <w:bCs/>
+        </w:rPr>
+      </w:pPr>
+      <w:r>
+        <w:rPr>
+          <w:b/>
+          <w:bCs/>
+        </w:rPr>
+        <w:t>3.3 Requerimientos de Arquitectura Base</w:t>
+      </w:r>
+    </w:p>
+    <w:tbl>
+      <w:tblPr>
+        <w:tblW w:w="0" w:type="auto"/>
+        <w:tblCellSpacing w:w="15" w:type="dxa"/>
+        <w:tblCellMar>
+          <w:left w:w="0" w:type="dxa"/>
+          <w:right w:w="0" w:type="dxa"/>
+        </w:tblCellMar>
+        <w:tblLook w:val="04A0" w:firstRow="1" w:lastRow="0" w:firstColumn="1" w:lastColumn="0" w:noHBand="0" w:noVBand="1"/>
+      </w:tblPr>
+      <w:tblGrid>
+        <w:gridCol w:w="1425"/>
+        <w:gridCol w:w="2244"/>
+        <w:gridCol w:w="1421"/>
+        <w:gridCol w:w="3398"/>
+      </w:tblGrid>
       <w:tr>
         <w:trPr>
           <w:tblCellSpacing w:w="15" w:type="dxa"/>
@@ -1017,309 +1507,16 @@
               <w:bottom w:val="single" w:sz="6" w:space="0" w:color="auto"/>
               <w:right w:val="single" w:sz="6" w:space="0" w:color="auto"/>
             </w:tcBorders>
+            <w:tcMar>
+              <w:top w:w="120" w:type="dxa"/>
+              <w:left w:w="180" w:type="dxa"/>
+              <w:bottom w:w="120" w:type="dxa"/>
+              <w:right w:w="180" w:type="dxa"/>
+            </w:tcMar>
             <w:vAlign w:val="center"/>
             <w:hideMark/>
           </w:tcPr>
           <w:p>
-            <w:pPr>
-              <w:rPr>
-                <w:b/>
-                <w:bCs/>
-              </w:rPr>
-            </w:pPr>
-            <w:r>
-              <w:rPr>
-                <w:b/>
-                <w:bCs/>
-              </w:rPr>
-              <w:t>RF-5</w:t>
-            </w:r>
-          </w:p>
-        </w:tc>
-        <w:tc>
-          <w:tcPr>
-            <w:tcW w:w="0" w:type="auto"/>
-            <w:tcBorders>
-              <w:top w:val="single" w:sz="6" w:space="0" w:color="auto"/>
-              <w:left w:val="single" w:sz="6" w:space="0" w:color="auto"/>
-              <w:bottom w:val="single" w:sz="6" w:space="0" w:color="auto"/>
-              <w:right w:val="single" w:sz="6" w:space="0" w:color="auto"/>
-            </w:tcBorders>
-            <w:vAlign w:val="center"/>
-            <w:hideMark/>
-          </w:tcPr>
-          <w:p>
-            <w:pPr>
-              <w:rPr>
-                <w:b/>
-                <w:bCs/>
-              </w:rPr>
-            </w:pPr>
-            <w:r>
-              <w:rPr>
-                <w:b/>
-                <w:bCs/>
-              </w:rPr>
-              <w:t>Presupuestación</w:t>
-            </w:r>
-          </w:p>
-        </w:tc>
-        <w:tc>
-          <w:tcPr>
-            <w:tcW w:w="0" w:type="auto"/>
-            <w:tcBorders>
-              <w:top w:val="single" w:sz="6" w:space="0" w:color="auto"/>
-              <w:left w:val="single" w:sz="6" w:space="0" w:color="auto"/>
-              <w:bottom w:val="single" w:sz="6" w:space="0" w:color="auto"/>
-              <w:right w:val="single" w:sz="6" w:space="0" w:color="auto"/>
-            </w:tcBorders>
-            <w:vAlign w:val="center"/>
-            <w:hideMark/>
-          </w:tcPr>
-          <w:p>
-            <w:pPr>
-              <w:rPr>
-                <w:b/>
-                <w:bCs/>
-              </w:rPr>
-            </w:pPr>
-            <w:r>
-              <w:rPr>
-                <w:b/>
-                <w:bCs/>
-              </w:rPr>
-              <w:t>Alta</w:t>
-            </w:r>
-          </w:p>
-        </w:tc>
-        <w:tc>
-          <w:tcPr>
-            <w:tcW w:w="0" w:type="auto"/>
-            <w:tcBorders>
-              <w:top w:val="single" w:sz="6" w:space="0" w:color="auto"/>
-              <w:left w:val="single" w:sz="6" w:space="0" w:color="auto"/>
-              <w:bottom w:val="single" w:sz="6" w:space="0" w:color="auto"/>
-              <w:right w:val="single" w:sz="6" w:space="0" w:color="auto"/>
-            </w:tcBorders>
-            <w:vAlign w:val="center"/>
-            <w:hideMark/>
-          </w:tcPr>
-          <w:p>
-            <w:pPr>
-              <w:rPr>
-                <w:b/>
-                <w:bCs/>
-              </w:rPr>
-            </w:pPr>
-            <w:r>
-              <w:rPr>
-                <w:b/>
-                <w:bCs/>
-              </w:rPr>
-              <w:t>Generación de presupuestos para trabajos a medida antes de convertirlos en venta formal.</w:t>
-            </w:r>
-          </w:p>
-        </w:tc>
-      </w:tr>
-      <w:tr>
-        <w:trPr>
-          <w:tblCellSpacing w:w="15" w:type="dxa"/>
-        </w:trPr>
-        <w:tc>
-          <w:tcPr>
-            <w:tcW w:w="0" w:type="auto"/>
-            <w:tcBorders>
-              <w:top w:val="single" w:sz="6" w:space="0" w:color="auto"/>
-              <w:left w:val="single" w:sz="6" w:space="0" w:color="auto"/>
-              <w:bottom w:val="single" w:sz="6" w:space="0" w:color="auto"/>
-              <w:right w:val="single" w:sz="6" w:space="0" w:color="auto"/>
-            </w:tcBorders>
-            <w:vAlign w:val="center"/>
-            <w:hideMark/>
-          </w:tcPr>
-          <w:p>
-            <w:pPr>
-              <w:rPr>
-                <w:b/>
-                <w:bCs/>
-              </w:rPr>
-            </w:pPr>
-            <w:r>
-              <w:rPr>
-                <w:b/>
-                <w:bCs/>
-              </w:rPr>
-              <w:t>RF-6</w:t>
-            </w:r>
-          </w:p>
-        </w:tc>
-        <w:tc>
-          <w:tcPr>
-            <w:tcW w:w="0" w:type="auto"/>
-            <w:tcBorders>
-              <w:top w:val="single" w:sz="6" w:space="0" w:color="auto"/>
-              <w:left w:val="single" w:sz="6" w:space="0" w:color="auto"/>
-              <w:bottom w:val="single" w:sz="6" w:space="0" w:color="auto"/>
-              <w:right w:val="single" w:sz="6" w:space="0" w:color="auto"/>
-            </w:tcBorders>
-            <w:vAlign w:val="center"/>
-            <w:hideMark/>
-          </w:tcPr>
-          <w:p>
-            <w:pPr>
-              <w:rPr>
-                <w:b/>
-                <w:bCs/>
-              </w:rPr>
-            </w:pPr>
-            <w:r>
-              <w:rPr>
-                <w:b/>
-                <w:bCs/>
-              </w:rPr>
-              <w:t>Alertas de Stock Crítico</w:t>
-            </w:r>
-          </w:p>
-        </w:tc>
-        <w:tc>
-          <w:tcPr>
-            <w:tcW w:w="0" w:type="auto"/>
-            <w:tcBorders>
-              <w:top w:val="single" w:sz="6" w:space="0" w:color="auto"/>
-              <w:left w:val="single" w:sz="6" w:space="0" w:color="auto"/>
-              <w:bottom w:val="single" w:sz="6" w:space="0" w:color="auto"/>
-              <w:right w:val="single" w:sz="6" w:space="0" w:color="auto"/>
-            </w:tcBorders>
-            <w:vAlign w:val="center"/>
-            <w:hideMark/>
-          </w:tcPr>
-          <w:p>
-            <w:pPr>
-              <w:rPr>
-                <w:b/>
-                <w:bCs/>
-              </w:rPr>
-            </w:pPr>
-            <w:r>
-              <w:rPr>
-                <w:b/>
-                <w:bCs/>
-              </w:rPr>
-              <w:t>Media</w:t>
-            </w:r>
-          </w:p>
-        </w:tc>
-        <w:tc>
-          <w:tcPr>
-            <w:tcW w:w="0" w:type="auto"/>
-            <w:tcBorders>
-              <w:top w:val="single" w:sz="6" w:space="0" w:color="auto"/>
-              <w:left w:val="single" w:sz="6" w:space="0" w:color="auto"/>
-              <w:bottom w:val="single" w:sz="6" w:space="0" w:color="auto"/>
-              <w:right w:val="single" w:sz="6" w:space="0" w:color="auto"/>
-            </w:tcBorders>
-            <w:vAlign w:val="center"/>
-            <w:hideMark/>
-          </w:tcPr>
-          <w:p>
-            <w:pPr>
-              <w:rPr>
-                <w:b/>
-                <w:bCs/>
-              </w:rPr>
-            </w:pPr>
-            <w:r>
-              <w:rPr>
-                <w:b/>
-                <w:bCs/>
-              </w:rPr>
-              <w:t>El sistema debe notificar cuando la materia prima baje de un umbral mínimo.</w:t>
-            </w:r>
-          </w:p>
-        </w:tc>
-      </w:tr>
-    </w:tbl>
-    <w:p>
-      <w:pPr>
-        <w:rPr>
-          <w:b/>
-          <w:bCs/>
-        </w:rPr>
-      </w:pPr>
-    </w:p>
-    <w:p>
-      <w:pPr>
-        <w:rPr>
-          <w:b/>
-          <w:bCs/>
-        </w:rPr>
-      </w:pPr>
-      <w:r>
-        <w:rPr>
-          <w:b/>
-          <w:bCs/>
-        </w:rPr>
-        <w:br w:type="page"/>
-      </w:r>
-    </w:p>
-    <w:p>
-      <w:pPr>
-        <w:rPr>
-          <w:b/>
-          <w:bCs/>
-        </w:rPr>
-      </w:pPr>
-      <w:r>
-        <w:rPr>
-          <w:b/>
-          <w:bCs/>
-        </w:rPr>
-        <w:lastRenderedPageBreak/>
-        <w:t>3.2 Requerimientos No Funcionales (RNF)</w:t>
-      </w:r>
-    </w:p>
-    <w:tbl>
-      <w:tblPr>
-        <w:tblW w:w="0" w:type="auto"/>
-        <w:tblCellSpacing w:w="15" w:type="dxa"/>
-        <w:tblCellMar>
-          <w:top w:w="15" w:type="dxa"/>
-          <w:left w:w="15" w:type="dxa"/>
-          <w:bottom w:w="15" w:type="dxa"/>
-          <w:right w:w="15" w:type="dxa"/>
-        </w:tblCellMar>
-        <w:tblLook w:val="04A0" w:firstRow="1" w:lastRow="0" w:firstColumn="1" w:lastColumn="0" w:noHBand="0" w:noVBand="1"/>
-      </w:tblPr>
-      <w:tblGrid>
-        <w:gridCol w:w="678"/>
-        <w:gridCol w:w="2086"/>
-        <w:gridCol w:w="1091"/>
-        <w:gridCol w:w="4633"/>
-      </w:tblGrid>
-      <w:tr>
-        <w:trPr>
-          <w:tblHeader/>
-          <w:tblCellSpacing w:w="15" w:type="dxa"/>
-        </w:trPr>
-        <w:tc>
-          <w:tcPr>
-            <w:tcW w:w="0" w:type="auto"/>
-            <w:tcBorders>
-              <w:top w:val="single" w:sz="6" w:space="0" w:color="auto"/>
-              <w:left w:val="single" w:sz="6" w:space="0" w:color="auto"/>
-              <w:bottom w:val="single" w:sz="6" w:space="0" w:color="auto"/>
-              <w:right w:val="single" w:sz="6" w:space="0" w:color="auto"/>
-            </w:tcBorders>
-            <w:vAlign w:val="center"/>
-            <w:hideMark/>
-          </w:tcPr>
-          <w:p>
-            <w:pPr>
-              <w:rPr>
-                <w:b/>
-                <w:bCs/>
-              </w:rPr>
-            </w:pPr>
             <w:r>
               <w:rPr>
                 <w:b/>
@@ -1338,16 +1535,16 @@
               <w:bottom w:val="single" w:sz="6" w:space="0" w:color="auto"/>
               <w:right w:val="single" w:sz="6" w:space="0" w:color="auto"/>
             </w:tcBorders>
+            <w:tcMar>
+              <w:top w:w="120" w:type="dxa"/>
+              <w:left w:w="180" w:type="dxa"/>
+              <w:bottom w:w="120" w:type="dxa"/>
+              <w:right w:w="180" w:type="dxa"/>
+            </w:tcMar>
             <w:vAlign w:val="center"/>
             <w:hideMark/>
           </w:tcPr>
           <w:p>
-            <w:pPr>
-              <w:rPr>
-                <w:b/>
-                <w:bCs/>
-              </w:rPr>
-            </w:pPr>
             <w:r>
               <w:rPr>
                 <w:b/>
@@ -1366,16 +1563,16 @@
               <w:bottom w:val="single" w:sz="6" w:space="0" w:color="auto"/>
               <w:right w:val="single" w:sz="6" w:space="0" w:color="auto"/>
             </w:tcBorders>
+            <w:tcMar>
+              <w:top w:w="120" w:type="dxa"/>
+              <w:left w:w="180" w:type="dxa"/>
+              <w:bottom w:w="120" w:type="dxa"/>
+              <w:right w:w="180" w:type="dxa"/>
+            </w:tcMar>
             <w:vAlign w:val="center"/>
             <w:hideMark/>
           </w:tcPr>
           <w:p>
-            <w:pPr>
-              <w:rPr>
-                <w:b/>
-                <w:bCs/>
-              </w:rPr>
-            </w:pPr>
             <w:r>
               <w:rPr>
                 <w:b/>
@@ -1394,16 +1591,16 @@
               <w:bottom w:val="single" w:sz="6" w:space="0" w:color="auto"/>
               <w:right w:val="single" w:sz="6" w:space="0" w:color="auto"/>
             </w:tcBorders>
+            <w:tcMar>
+              <w:top w:w="120" w:type="dxa"/>
+              <w:left w:w="180" w:type="dxa"/>
+              <w:bottom w:w="120" w:type="dxa"/>
+              <w:right w:w="180" w:type="dxa"/>
+            </w:tcMar>
             <w:vAlign w:val="center"/>
             <w:hideMark/>
           </w:tcPr>
           <w:p>
-            <w:pPr>
-              <w:rPr>
-                <w:b/>
-                <w:bCs/>
-              </w:rPr>
-            </w:pPr>
             <w:r>
               <w:rPr>
                 <w:b/>
@@ -1427,22 +1624,23 @@
               <w:bottom w:val="single" w:sz="6" w:space="0" w:color="auto"/>
               <w:right w:val="single" w:sz="6" w:space="0" w:color="auto"/>
             </w:tcBorders>
+            <w:tcMar>
+              <w:top w:w="120" w:type="dxa"/>
+              <w:left w:w="180" w:type="dxa"/>
+              <w:bottom w:w="120" w:type="dxa"/>
+              <w:right w:w="180" w:type="dxa"/>
+            </w:tcMar>
             <w:vAlign w:val="center"/>
             <w:hideMark/>
           </w:tcPr>
           <w:p>
-            <w:pPr>
-              <w:rPr>
-                <w:b/>
-                <w:bCs/>
-              </w:rPr>
-            </w:pPr>
             <w:r>
               <w:rPr>
                 <w:b/>
                 <w:bCs/>
               </w:rPr>
-              <w:t>RNF-1</w:t>
+              <w:lastRenderedPageBreak/>
+              <w:t>REQ009</w:t>
             </w:r>
           </w:p>
         </w:tc>
@@ -1455,22 +1653,44 @@
               <w:bottom w:val="single" w:sz="6" w:space="0" w:color="auto"/>
               <w:right w:val="single" w:sz="6" w:space="0" w:color="auto"/>
             </w:tcBorders>
+            <w:tcMar>
+              <w:top w:w="120" w:type="dxa"/>
+              <w:left w:w="180" w:type="dxa"/>
+              <w:bottom w:w="120" w:type="dxa"/>
+              <w:right w:w="180" w:type="dxa"/>
+            </w:tcMar>
             <w:vAlign w:val="center"/>
             <w:hideMark/>
           </w:tcPr>
           <w:p>
-            <w:pPr>
-              <w:rPr>
-                <w:b/>
-                <w:bCs/>
-              </w:rPr>
-            </w:pPr>
+            <w:proofErr w:type="spellStart"/>
             <w:r>
-              <w:rPr>
-                <w:b/>
-                <w:bCs/>
-              </w:rPr>
-              <w:t>Seguridad de Acceso</w:t>
+              <w:t>Multiidioma</w:t>
+            </w:r>
+            <w:proofErr w:type="spellEnd"/>
+          </w:p>
+        </w:tc>
+        <w:tc>
+          <w:tcPr>
+            <w:tcW w:w="0" w:type="auto"/>
+            <w:tcBorders>
+              <w:top w:val="single" w:sz="6" w:space="0" w:color="auto"/>
+              <w:left w:val="single" w:sz="6" w:space="0" w:color="auto"/>
+              <w:bottom w:val="single" w:sz="6" w:space="0" w:color="auto"/>
+              <w:right w:val="single" w:sz="6" w:space="0" w:color="auto"/>
+            </w:tcBorders>
+            <w:tcMar>
+              <w:top w:w="120" w:type="dxa"/>
+              <w:left w:w="180" w:type="dxa"/>
+              <w:bottom w:w="120" w:type="dxa"/>
+              <w:right w:w="180" w:type="dxa"/>
+            </w:tcMar>
+            <w:vAlign w:val="center"/>
+            <w:hideMark/>
+          </w:tcPr>
+          <w:p>
+            <w:r>
+              <w:t>Baja</w:t>
             </w:r>
           </w:p>
         </w:tc>
@@ -1483,66 +1703,18 @@
               <w:bottom w:val="single" w:sz="6" w:space="0" w:color="auto"/>
               <w:right w:val="single" w:sz="6" w:space="0" w:color="auto"/>
             </w:tcBorders>
+            <w:tcMar>
+              <w:top w:w="120" w:type="dxa"/>
+              <w:left w:w="180" w:type="dxa"/>
+              <w:bottom w:w="120" w:type="dxa"/>
+              <w:right w:w="180" w:type="dxa"/>
+            </w:tcMar>
             <w:vAlign w:val="center"/>
             <w:hideMark/>
           </w:tcPr>
           <w:p>
-            <w:pPr>
-              <w:rPr>
-                <w:b/>
-                <w:bCs/>
-              </w:rPr>
-            </w:pPr>
             <w:r>
-              <w:rPr>
-                <w:b/>
-                <w:bCs/>
-              </w:rPr>
-              <w:t>Alta</w:t>
-            </w:r>
-          </w:p>
-        </w:tc>
-        <w:tc>
-          <w:tcPr>
-            <w:tcW w:w="0" w:type="auto"/>
-            <w:tcBorders>
-              <w:top w:val="single" w:sz="6" w:space="0" w:color="auto"/>
-              <w:left w:val="single" w:sz="6" w:space="0" w:color="auto"/>
-              <w:bottom w:val="single" w:sz="6" w:space="0" w:color="auto"/>
-              <w:right w:val="single" w:sz="6" w:space="0" w:color="auto"/>
-            </w:tcBorders>
-            <w:vAlign w:val="center"/>
-            <w:hideMark/>
-          </w:tcPr>
-          <w:p>
-            <w:pPr>
-              <w:rPr>
-                <w:b/>
-                <w:bCs/>
-              </w:rPr>
-            </w:pPr>
-            <w:r>
-              <w:rPr>
-                <w:b/>
-                <w:bCs/>
-              </w:rPr>
-              <w:t>El acceso debe estar restringido por roles de usuario (</w:t>
-            </w:r>
-            <w:proofErr w:type="spellStart"/>
-            <w:r>
-              <w:rPr>
-                <w:b/>
-                <w:bCs/>
-              </w:rPr>
-              <w:t>Admin</w:t>
-            </w:r>
-            <w:proofErr w:type="spellEnd"/>
-            <w:r>
-              <w:rPr>
-                <w:b/>
-                <w:bCs/>
-              </w:rPr>
-              <w:t>, Vendedor, Depósito).</w:t>
+              <w:t>Preparado para soportar múltiples idiomas en la interfaz de usuario en futuras versiones.</w:t>
             </w:r>
           </w:p>
         </w:tc>
@@ -1560,22 +1732,22 @@
               <w:bottom w:val="single" w:sz="6" w:space="0" w:color="auto"/>
               <w:right w:val="single" w:sz="6" w:space="0" w:color="auto"/>
             </w:tcBorders>
+            <w:tcMar>
+              <w:top w:w="120" w:type="dxa"/>
+              <w:left w:w="180" w:type="dxa"/>
+              <w:bottom w:w="120" w:type="dxa"/>
+              <w:right w:w="180" w:type="dxa"/>
+            </w:tcMar>
             <w:vAlign w:val="center"/>
             <w:hideMark/>
           </w:tcPr>
           <w:p>
-            <w:pPr>
-              <w:rPr>
-                <w:b/>
-                <w:bCs/>
-              </w:rPr>
-            </w:pPr>
             <w:r>
               <w:rPr>
                 <w:b/>
                 <w:bCs/>
               </w:rPr>
-              <w:t>RNF-2</w:t>
+              <w:t>REQ022</w:t>
             </w:r>
           </w:p>
         </w:tc>
@@ -1588,22 +1760,18 @@
               <w:bottom w:val="single" w:sz="6" w:space="0" w:color="auto"/>
               <w:right w:val="single" w:sz="6" w:space="0" w:color="auto"/>
             </w:tcBorders>
+            <w:tcMar>
+              <w:top w:w="120" w:type="dxa"/>
+              <w:left w:w="180" w:type="dxa"/>
+              <w:bottom w:w="120" w:type="dxa"/>
+              <w:right w:w="180" w:type="dxa"/>
+            </w:tcMar>
             <w:vAlign w:val="center"/>
             <w:hideMark/>
           </w:tcPr>
           <w:p>
-            <w:pPr>
-              <w:rPr>
-                <w:b/>
-                <w:bCs/>
-              </w:rPr>
-            </w:pPr>
             <w:r>
-              <w:rPr>
-                <w:b/>
-                <w:bCs/>
-              </w:rPr>
-              <w:t>Robustez de Datos</w:t>
+              <w:t>Criptografía</w:t>
             </w:r>
           </w:p>
         </w:tc>
@@ -1616,21 +1784,17 @@
               <w:bottom w:val="single" w:sz="6" w:space="0" w:color="auto"/>
               <w:right w:val="single" w:sz="6" w:space="0" w:color="auto"/>
             </w:tcBorders>
+            <w:tcMar>
+              <w:top w:w="120" w:type="dxa"/>
+              <w:left w:w="180" w:type="dxa"/>
+              <w:bottom w:w="120" w:type="dxa"/>
+              <w:right w:w="180" w:type="dxa"/>
+            </w:tcMar>
             <w:vAlign w:val="center"/>
             <w:hideMark/>
           </w:tcPr>
           <w:p>
-            <w:pPr>
-              <w:rPr>
-                <w:b/>
-                <w:bCs/>
-              </w:rPr>
-            </w:pPr>
             <w:r>
-              <w:rPr>
-                <w:b/>
-                <w:bCs/>
-              </w:rPr>
               <w:t>Alta</w:t>
             </w:r>
           </w:p>
@@ -1644,22 +1808,18 @@
               <w:bottom w:val="single" w:sz="6" w:space="0" w:color="auto"/>
               <w:right w:val="single" w:sz="6" w:space="0" w:color="auto"/>
             </w:tcBorders>
+            <w:tcMar>
+              <w:top w:w="120" w:type="dxa"/>
+              <w:left w:w="180" w:type="dxa"/>
+              <w:bottom w:w="120" w:type="dxa"/>
+              <w:right w:w="180" w:type="dxa"/>
+            </w:tcMar>
             <w:vAlign w:val="center"/>
             <w:hideMark/>
           </w:tcPr>
           <w:p>
-            <w:pPr>
-              <w:rPr>
-                <w:b/>
-                <w:bCs/>
-              </w:rPr>
-            </w:pPr>
             <w:r>
-              <w:rPr>
-                <w:b/>
-                <w:bCs/>
-              </w:rPr>
-              <w:t>El sistema debe manejar transacciones (ACID) para evitar inconsistencias en el stock.</w:t>
+              <w:t>Datos sensibles deben almacenarse y transmitirse encriptados (algoritmos robustos).</w:t>
             </w:r>
           </w:p>
         </w:tc>
@@ -1677,22 +1837,22 @@
               <w:bottom w:val="single" w:sz="6" w:space="0" w:color="auto"/>
               <w:right w:val="single" w:sz="6" w:space="0" w:color="auto"/>
             </w:tcBorders>
+            <w:tcMar>
+              <w:top w:w="120" w:type="dxa"/>
+              <w:left w:w="180" w:type="dxa"/>
+              <w:bottom w:w="120" w:type="dxa"/>
+              <w:right w:w="180" w:type="dxa"/>
+            </w:tcMar>
             <w:vAlign w:val="center"/>
             <w:hideMark/>
           </w:tcPr>
           <w:p>
-            <w:pPr>
-              <w:rPr>
-                <w:b/>
-                <w:bCs/>
-              </w:rPr>
-            </w:pPr>
             <w:r>
               <w:rPr>
                 <w:b/>
                 <w:bCs/>
               </w:rPr>
-              <w:t>RNF-3</w:t>
+              <w:t>REQ023</w:t>
             </w:r>
           </w:p>
         </w:tc>
@@ -1705,22 +1865,18 @@
               <w:bottom w:val="single" w:sz="6" w:space="0" w:color="auto"/>
               <w:right w:val="single" w:sz="6" w:space="0" w:color="auto"/>
             </w:tcBorders>
+            <w:tcMar>
+              <w:top w:w="120" w:type="dxa"/>
+              <w:left w:w="180" w:type="dxa"/>
+              <w:bottom w:w="120" w:type="dxa"/>
+              <w:right w:w="180" w:type="dxa"/>
+            </w:tcMar>
             <w:vAlign w:val="center"/>
             <w:hideMark/>
           </w:tcPr>
           <w:p>
-            <w:pPr>
-              <w:rPr>
-                <w:b/>
-                <w:bCs/>
-              </w:rPr>
-            </w:pPr>
             <w:r>
-              <w:rPr>
-                <w:b/>
-                <w:bCs/>
-              </w:rPr>
-              <w:t>Disponibilidad Local</w:t>
+              <w:t>Bitácora (Logs)</w:t>
             </w:r>
           </w:p>
         </w:tc>
@@ -1733,21 +1889,17 @@
               <w:bottom w:val="single" w:sz="6" w:space="0" w:color="auto"/>
               <w:right w:val="single" w:sz="6" w:space="0" w:color="auto"/>
             </w:tcBorders>
+            <w:tcMar>
+              <w:top w:w="120" w:type="dxa"/>
+              <w:left w:w="180" w:type="dxa"/>
+              <w:bottom w:w="120" w:type="dxa"/>
+              <w:right w:w="180" w:type="dxa"/>
+            </w:tcMar>
             <w:vAlign w:val="center"/>
             <w:hideMark/>
           </w:tcPr>
           <w:p>
-            <w:pPr>
-              <w:rPr>
-                <w:b/>
-                <w:bCs/>
-              </w:rPr>
-            </w:pPr>
             <w:r>
-              <w:rPr>
-                <w:b/>
-                <w:bCs/>
-              </w:rPr>
               <w:t>Alta</w:t>
             </w:r>
           </w:p>
@@ -1761,22 +1913,18 @@
               <w:bottom w:val="single" w:sz="6" w:space="0" w:color="auto"/>
               <w:right w:val="single" w:sz="6" w:space="0" w:color="auto"/>
             </w:tcBorders>
+            <w:tcMar>
+              <w:top w:w="120" w:type="dxa"/>
+              <w:left w:w="180" w:type="dxa"/>
+              <w:bottom w:w="120" w:type="dxa"/>
+              <w:right w:w="180" w:type="dxa"/>
+            </w:tcMar>
             <w:vAlign w:val="center"/>
             <w:hideMark/>
           </w:tcPr>
           <w:p>
-            <w:pPr>
-              <w:rPr>
-                <w:b/>
-                <w:bCs/>
-              </w:rPr>
-            </w:pPr>
             <w:r>
-              <w:rPr>
-                <w:b/>
-                <w:bCs/>
-              </w:rPr>
-              <w:t>El software debe operar de forma autónoma en entorno de escritorio sin dependencia de internet constante.</w:t>
+              <w:t>Registro detallado (log de auditoría) de operaciones críticas por usuarios.</w:t>
             </w:r>
           </w:p>
         </w:tc>
@@ -1794,22 +1942,22 @@
               <w:bottom w:val="single" w:sz="6" w:space="0" w:color="auto"/>
               <w:right w:val="single" w:sz="6" w:space="0" w:color="auto"/>
             </w:tcBorders>
+            <w:tcMar>
+              <w:top w:w="120" w:type="dxa"/>
+              <w:left w:w="180" w:type="dxa"/>
+              <w:bottom w:w="120" w:type="dxa"/>
+              <w:right w:w="180" w:type="dxa"/>
+            </w:tcMar>
             <w:vAlign w:val="center"/>
             <w:hideMark/>
           </w:tcPr>
           <w:p>
-            <w:pPr>
-              <w:rPr>
-                <w:b/>
-                <w:bCs/>
-              </w:rPr>
-            </w:pPr>
             <w:r>
               <w:rPr>
                 <w:b/>
                 <w:bCs/>
               </w:rPr>
-              <w:t>RNF-4</w:t>
+              <w:t>REQ024</w:t>
             </w:r>
           </w:p>
         </w:tc>
@@ -1822,22 +1970,18 @@
               <w:bottom w:val="single" w:sz="6" w:space="0" w:color="auto"/>
               <w:right w:val="single" w:sz="6" w:space="0" w:color="auto"/>
             </w:tcBorders>
+            <w:tcMar>
+              <w:top w:w="120" w:type="dxa"/>
+              <w:left w:w="180" w:type="dxa"/>
+              <w:bottom w:w="120" w:type="dxa"/>
+              <w:right w:w="180" w:type="dxa"/>
+            </w:tcMar>
             <w:vAlign w:val="center"/>
             <w:hideMark/>
           </w:tcPr>
           <w:p>
-            <w:pPr>
-              <w:rPr>
-                <w:b/>
-                <w:bCs/>
-              </w:rPr>
-            </w:pPr>
             <w:r>
-              <w:rPr>
-                <w:b/>
-                <w:bCs/>
-              </w:rPr>
-              <w:t>Persistencia</w:t>
+              <w:t>Gestión de Excepciones</w:t>
             </w:r>
           </w:p>
         </w:tc>
@@ -1850,21 +1994,17 @@
               <w:bottom w:val="single" w:sz="6" w:space="0" w:color="auto"/>
               <w:right w:val="single" w:sz="6" w:space="0" w:color="auto"/>
             </w:tcBorders>
+            <w:tcMar>
+              <w:top w:w="120" w:type="dxa"/>
+              <w:left w:w="180" w:type="dxa"/>
+              <w:bottom w:w="120" w:type="dxa"/>
+              <w:right w:w="180" w:type="dxa"/>
+            </w:tcMar>
             <w:vAlign w:val="center"/>
             <w:hideMark/>
           </w:tcPr>
           <w:p>
-            <w:pPr>
-              <w:rPr>
-                <w:b/>
-                <w:bCs/>
-              </w:rPr>
-            </w:pPr>
             <w:r>
-              <w:rPr>
-                <w:b/>
-                <w:bCs/>
-              </w:rPr>
               <w:t>Alta</w:t>
             </w:r>
           </w:p>
@@ -1878,22 +2018,341 @@
               <w:bottom w:val="single" w:sz="6" w:space="0" w:color="auto"/>
               <w:right w:val="single" w:sz="6" w:space="0" w:color="auto"/>
             </w:tcBorders>
+            <w:tcMar>
+              <w:top w:w="120" w:type="dxa"/>
+              <w:left w:w="180" w:type="dxa"/>
+              <w:bottom w:w="120" w:type="dxa"/>
+              <w:right w:w="180" w:type="dxa"/>
+            </w:tcMar>
             <w:vAlign w:val="center"/>
             <w:hideMark/>
           </w:tcPr>
           <w:p>
-            <w:pPr>
-              <w:rPr>
-                <w:b/>
-                <w:bCs/>
-              </w:rPr>
-            </w:pPr>
+            <w:r>
+              <w:t>Captura y manejo de errores controlado, evitando caídas abruptas.</w:t>
+            </w:r>
+          </w:p>
+        </w:tc>
+      </w:tr>
+      <w:tr>
+        <w:trPr>
+          <w:tblCellSpacing w:w="15" w:type="dxa"/>
+        </w:trPr>
+        <w:tc>
+          <w:tcPr>
+            <w:tcW w:w="0" w:type="auto"/>
+            <w:tcBorders>
+              <w:top w:val="single" w:sz="6" w:space="0" w:color="auto"/>
+              <w:left w:val="single" w:sz="6" w:space="0" w:color="auto"/>
+              <w:bottom w:val="single" w:sz="6" w:space="0" w:color="auto"/>
+              <w:right w:val="single" w:sz="6" w:space="0" w:color="auto"/>
+            </w:tcBorders>
+            <w:tcMar>
+              <w:top w:w="120" w:type="dxa"/>
+              <w:left w:w="180" w:type="dxa"/>
+              <w:bottom w:w="120" w:type="dxa"/>
+              <w:right w:w="180" w:type="dxa"/>
+            </w:tcMar>
+            <w:vAlign w:val="center"/>
+            <w:hideMark/>
+          </w:tcPr>
+          <w:p>
             <w:r>
               <w:rPr>
                 <w:b/>
                 <w:bCs/>
               </w:rPr>
-              <w:t>Uso de base de datos relacional para asegurar la integridad de los registros históricos.</w:t>
+              <w:t>REQ025</w:t>
+            </w:r>
+          </w:p>
+        </w:tc>
+        <w:tc>
+          <w:tcPr>
+            <w:tcW w:w="0" w:type="auto"/>
+            <w:tcBorders>
+              <w:top w:val="single" w:sz="6" w:space="0" w:color="auto"/>
+              <w:left w:val="single" w:sz="6" w:space="0" w:color="auto"/>
+              <w:bottom w:val="single" w:sz="6" w:space="0" w:color="auto"/>
+              <w:right w:val="single" w:sz="6" w:space="0" w:color="auto"/>
+            </w:tcBorders>
+            <w:tcMar>
+              <w:top w:w="120" w:type="dxa"/>
+              <w:left w:w="180" w:type="dxa"/>
+              <w:bottom w:w="120" w:type="dxa"/>
+              <w:right w:w="180" w:type="dxa"/>
+            </w:tcMar>
+            <w:vAlign w:val="center"/>
+            <w:hideMark/>
+          </w:tcPr>
+          <w:p>
+            <w:r>
+              <w:t>Respaldo de Datos</w:t>
+            </w:r>
+          </w:p>
+        </w:tc>
+        <w:tc>
+          <w:tcPr>
+            <w:tcW w:w="0" w:type="auto"/>
+            <w:tcBorders>
+              <w:top w:val="single" w:sz="6" w:space="0" w:color="auto"/>
+              <w:left w:val="single" w:sz="6" w:space="0" w:color="auto"/>
+              <w:bottom w:val="single" w:sz="6" w:space="0" w:color="auto"/>
+              <w:right w:val="single" w:sz="6" w:space="0" w:color="auto"/>
+            </w:tcBorders>
+            <w:tcMar>
+              <w:top w:w="120" w:type="dxa"/>
+              <w:left w:w="180" w:type="dxa"/>
+              <w:bottom w:w="120" w:type="dxa"/>
+              <w:right w:w="180" w:type="dxa"/>
+            </w:tcMar>
+            <w:vAlign w:val="center"/>
+            <w:hideMark/>
+          </w:tcPr>
+          <w:p>
+            <w:r>
+              <w:t>Alta</w:t>
+            </w:r>
+          </w:p>
+        </w:tc>
+        <w:tc>
+          <w:tcPr>
+            <w:tcW w:w="0" w:type="auto"/>
+            <w:tcBorders>
+              <w:top w:val="single" w:sz="6" w:space="0" w:color="auto"/>
+              <w:left w:val="single" w:sz="6" w:space="0" w:color="auto"/>
+              <w:bottom w:val="single" w:sz="6" w:space="0" w:color="auto"/>
+              <w:right w:val="single" w:sz="6" w:space="0" w:color="auto"/>
+            </w:tcBorders>
+            <w:tcMar>
+              <w:top w:w="120" w:type="dxa"/>
+              <w:left w:w="180" w:type="dxa"/>
+              <w:bottom w:w="120" w:type="dxa"/>
+              <w:right w:w="180" w:type="dxa"/>
+            </w:tcMar>
+            <w:vAlign w:val="center"/>
+            <w:hideMark/>
+          </w:tcPr>
+          <w:p>
+            <w:r>
+              <w:t>Mecanismos automáticos para copias de seguridad (</w:t>
+            </w:r>
+            <w:proofErr w:type="spellStart"/>
+            <w:r>
+              <w:t>backup</w:t>
+            </w:r>
+            <w:proofErr w:type="spellEnd"/>
+            <w:r>
+              <w:t>) periódicas de la BD.</w:t>
+            </w:r>
+          </w:p>
+        </w:tc>
+      </w:tr>
+      <w:tr>
+        <w:trPr>
+          <w:tblCellSpacing w:w="15" w:type="dxa"/>
+        </w:trPr>
+        <w:tc>
+          <w:tcPr>
+            <w:tcW w:w="0" w:type="auto"/>
+            <w:tcBorders>
+              <w:top w:val="single" w:sz="6" w:space="0" w:color="auto"/>
+              <w:left w:val="single" w:sz="6" w:space="0" w:color="auto"/>
+              <w:bottom w:val="single" w:sz="6" w:space="0" w:color="auto"/>
+              <w:right w:val="single" w:sz="6" w:space="0" w:color="auto"/>
+            </w:tcBorders>
+            <w:tcMar>
+              <w:top w:w="120" w:type="dxa"/>
+              <w:left w:w="180" w:type="dxa"/>
+              <w:bottom w:w="120" w:type="dxa"/>
+              <w:right w:w="180" w:type="dxa"/>
+            </w:tcMar>
+            <w:vAlign w:val="center"/>
+            <w:hideMark/>
+          </w:tcPr>
+          <w:p>
+            <w:r>
+              <w:rPr>
+                <w:b/>
+                <w:bCs/>
+              </w:rPr>
+              <w:t>REQ026a</w:t>
+            </w:r>
+          </w:p>
+        </w:tc>
+        <w:tc>
+          <w:tcPr>
+            <w:tcW w:w="0" w:type="auto"/>
+            <w:tcBorders>
+              <w:top w:val="single" w:sz="6" w:space="0" w:color="auto"/>
+              <w:left w:val="single" w:sz="6" w:space="0" w:color="auto"/>
+              <w:bottom w:val="single" w:sz="6" w:space="0" w:color="auto"/>
+              <w:right w:val="single" w:sz="6" w:space="0" w:color="auto"/>
+            </w:tcBorders>
+            <w:tcMar>
+              <w:top w:w="120" w:type="dxa"/>
+              <w:left w:w="180" w:type="dxa"/>
+              <w:bottom w:w="120" w:type="dxa"/>
+              <w:right w:w="180" w:type="dxa"/>
+            </w:tcMar>
+            <w:vAlign w:val="center"/>
+            <w:hideMark/>
+          </w:tcPr>
+          <w:p>
+            <w:r>
+              <w:t>Seguridad</w:t>
+            </w:r>
+          </w:p>
+        </w:tc>
+        <w:tc>
+          <w:tcPr>
+            <w:tcW w:w="0" w:type="auto"/>
+            <w:tcBorders>
+              <w:top w:val="single" w:sz="6" w:space="0" w:color="auto"/>
+              <w:left w:val="single" w:sz="6" w:space="0" w:color="auto"/>
+              <w:bottom w:val="single" w:sz="6" w:space="0" w:color="auto"/>
+              <w:right w:val="single" w:sz="6" w:space="0" w:color="auto"/>
+            </w:tcBorders>
+            <w:tcMar>
+              <w:top w:w="120" w:type="dxa"/>
+              <w:left w:w="180" w:type="dxa"/>
+              <w:bottom w:w="120" w:type="dxa"/>
+              <w:right w:w="180" w:type="dxa"/>
+            </w:tcMar>
+            <w:vAlign w:val="center"/>
+            <w:hideMark/>
+          </w:tcPr>
+          <w:p>
+            <w:r>
+              <w:t>Alta</w:t>
+            </w:r>
+          </w:p>
+        </w:tc>
+        <w:tc>
+          <w:tcPr>
+            <w:tcW w:w="0" w:type="auto"/>
+            <w:tcBorders>
+              <w:top w:val="single" w:sz="6" w:space="0" w:color="auto"/>
+              <w:left w:val="single" w:sz="6" w:space="0" w:color="auto"/>
+              <w:bottom w:val="single" w:sz="6" w:space="0" w:color="auto"/>
+              <w:right w:val="single" w:sz="6" w:space="0" w:color="auto"/>
+            </w:tcBorders>
+            <w:tcMar>
+              <w:top w:w="120" w:type="dxa"/>
+              <w:left w:w="180" w:type="dxa"/>
+              <w:bottom w:w="120" w:type="dxa"/>
+              <w:right w:w="180" w:type="dxa"/>
+            </w:tcMar>
+            <w:vAlign w:val="center"/>
+            <w:hideMark/>
+          </w:tcPr>
+          <w:p>
+            <w:r>
+              <w:t>Implementación de esquema de seguridad basado en roles (RBAC).</w:t>
+            </w:r>
+          </w:p>
+        </w:tc>
+      </w:tr>
+      <w:tr>
+        <w:trPr>
+          <w:tblCellSpacing w:w="15" w:type="dxa"/>
+        </w:trPr>
+        <w:tc>
+          <w:tcPr>
+            <w:tcW w:w="0" w:type="auto"/>
+            <w:tcBorders>
+              <w:top w:val="single" w:sz="6" w:space="0" w:color="auto"/>
+              <w:left w:val="single" w:sz="6" w:space="0" w:color="auto"/>
+              <w:bottom w:val="single" w:sz="6" w:space="0" w:color="auto"/>
+              <w:right w:val="single" w:sz="6" w:space="0" w:color="auto"/>
+            </w:tcBorders>
+            <w:tcMar>
+              <w:top w:w="120" w:type="dxa"/>
+              <w:left w:w="180" w:type="dxa"/>
+              <w:bottom w:w="120" w:type="dxa"/>
+              <w:right w:w="180" w:type="dxa"/>
+            </w:tcMar>
+            <w:vAlign w:val="center"/>
+            <w:hideMark/>
+          </w:tcPr>
+          <w:p>
+            <w:r>
+              <w:rPr>
+                <w:b/>
+                <w:bCs/>
+              </w:rPr>
+              <w:t>REQ026b</w:t>
+            </w:r>
+          </w:p>
+        </w:tc>
+        <w:tc>
+          <w:tcPr>
+            <w:tcW w:w="0" w:type="auto"/>
+            <w:tcBorders>
+              <w:top w:val="single" w:sz="6" w:space="0" w:color="auto"/>
+              <w:left w:val="single" w:sz="6" w:space="0" w:color="auto"/>
+              <w:bottom w:val="single" w:sz="6" w:space="0" w:color="auto"/>
+              <w:right w:val="single" w:sz="6" w:space="0" w:color="auto"/>
+            </w:tcBorders>
+            <w:tcMar>
+              <w:top w:w="120" w:type="dxa"/>
+              <w:left w:w="180" w:type="dxa"/>
+              <w:bottom w:w="120" w:type="dxa"/>
+              <w:right w:w="180" w:type="dxa"/>
+            </w:tcMar>
+            <w:vAlign w:val="center"/>
+            <w:hideMark/>
+          </w:tcPr>
+          <w:p>
+            <w:r>
+              <w:t>Consistencia de Información</w:t>
+            </w:r>
+          </w:p>
+        </w:tc>
+        <w:tc>
+          <w:tcPr>
+            <w:tcW w:w="0" w:type="auto"/>
+            <w:tcBorders>
+              <w:top w:val="single" w:sz="6" w:space="0" w:color="auto"/>
+              <w:left w:val="single" w:sz="6" w:space="0" w:color="auto"/>
+              <w:bottom w:val="single" w:sz="6" w:space="0" w:color="auto"/>
+              <w:right w:val="single" w:sz="6" w:space="0" w:color="auto"/>
+            </w:tcBorders>
+            <w:tcMar>
+              <w:top w:w="120" w:type="dxa"/>
+              <w:left w:w="180" w:type="dxa"/>
+              <w:bottom w:w="120" w:type="dxa"/>
+              <w:right w:w="180" w:type="dxa"/>
+            </w:tcMar>
+            <w:vAlign w:val="center"/>
+            <w:hideMark/>
+          </w:tcPr>
+          <w:p>
+            <w:r>
+              <w:t>Alta</w:t>
+            </w:r>
+          </w:p>
+        </w:tc>
+        <w:tc>
+          <w:tcPr>
+            <w:tcW w:w="0" w:type="auto"/>
+            <w:tcBorders>
+              <w:top w:val="single" w:sz="6" w:space="0" w:color="auto"/>
+              <w:left w:val="single" w:sz="6" w:space="0" w:color="auto"/>
+              <w:bottom w:val="single" w:sz="6" w:space="0" w:color="auto"/>
+              <w:right w:val="single" w:sz="6" w:space="0" w:color="auto"/>
+            </w:tcBorders>
+            <w:tcMar>
+              <w:top w:w="120" w:type="dxa"/>
+              <w:left w:w="180" w:type="dxa"/>
+              <w:bottom w:w="120" w:type="dxa"/>
+              <w:right w:w="180" w:type="dxa"/>
+            </w:tcMar>
+            <w:vAlign w:val="center"/>
+            <w:hideMark/>
+          </w:tcPr>
+          <w:p>
+            <w:r>
+              <w:t>Uso de transacciones para garantizar que operaciones complejas completen su ciclo o se reviertan.</w:t>
             </w:r>
           </w:p>
         </w:tc>
@@ -1911,131 +2370,33 @@
           <w:b/>
           <w:bCs/>
         </w:rPr>
-        <w:pict w14:anchorId="3473C160">
-          <v:rect id="_x0000_i1099" style="width:0;height:1.5pt" o:hralign="center" o:hrstd="t" o:hr="t" fillcolor="#a0a0a0" stroked="f"/>
-        </w:pict>
+        <w:t>4. Reglas de Negocio</w:t>
       </w:r>
     </w:p>
     <w:p>
       <w:pPr>
+        <w:numPr>
+          <w:ilvl w:val="0"/>
+          <w:numId w:val="25"/>
+        </w:numPr>
+      </w:pPr>
+      <w:r>
         <w:rPr>
           <w:b/>
           <w:bCs/>
         </w:rPr>
-      </w:pPr>
-      <w:r>
-        <w:rPr>
-          <w:b/>
-          <w:bCs/>
-        </w:rPr>
-        <w:t>4. Reglas de Negocio</w:t>
+        <w:t>Prioridad de Producción:</w:t>
+      </w:r>
+      <w:r>
+        <w:t xml:space="preserve"> Un pedido "a pedido" no puede pasar a la fase de despacho si no tiene una orden de fabricación marcada como "Finalizada".</w:t>
       </w:r>
     </w:p>
     <w:p>
       <w:pPr>
         <w:numPr>
           <w:ilvl w:val="0"/>
-          <w:numId w:val="15"/>
+          <w:numId w:val="25"/>
         </w:numPr>
-        <w:rPr>
-          <w:b/>
-          <w:bCs/>
-        </w:rPr>
-      </w:pPr>
-      <w:r>
-        <w:rPr>
-          <w:b/>
-          <w:bCs/>
-        </w:rPr>
-        <w:t>Prioridad de Producción: Un pedido "a pedido" no puede pasar a la fase de despacho si no tiene una orden de fabricación marcada como "Finalizada".</w:t>
-      </w:r>
-    </w:p>
-    <w:p>
-      <w:pPr>
-        <w:numPr>
-          <w:ilvl w:val="0"/>
-          <w:numId w:val="15"/>
-        </w:numPr>
-        <w:rPr>
-          <w:b/>
-          <w:bCs/>
-        </w:rPr>
-      </w:pPr>
-      <w:r>
-        <w:rPr>
-          <w:b/>
-          <w:bCs/>
-        </w:rPr>
-        <w:t>Validación de Stock: No se puede confirmar una venta de stock físico si la cantidad solicitada supera la disponible en depósito.</w:t>
-      </w:r>
-    </w:p>
-    <w:p>
-      <w:pPr>
-        <w:numPr>
-          <w:ilvl w:val="0"/>
-          <w:numId w:val="15"/>
-        </w:numPr>
-        <w:rPr>
-          <w:b/>
-          <w:bCs/>
-        </w:rPr>
-      </w:pPr>
-      <w:r>
-        <w:rPr>
-          <w:b/>
-          <w:bCs/>
-        </w:rPr>
-        <w:t>Gestión de Pagos: No se podrá realizar una nueva orden de compra a un proveedor si el saldo adeudado supera el límite de crédito preestablecido.</w:t>
-      </w:r>
-    </w:p>
-    <w:p>
-      <w:pPr>
-        <w:numPr>
-          <w:ilvl w:val="0"/>
-          <w:numId w:val="15"/>
-        </w:numPr>
-        <w:rPr>
-          <w:b/>
-          <w:bCs/>
-        </w:rPr>
-      </w:pPr>
-      <w:r>
-        <w:rPr>
-          <w:b/>
-          <w:bCs/>
-        </w:rPr>
-        <w:t>Confirmación de Producción: Todo producto "a pedido" debe registrar un pago de seña mínimo antes de habilitar la orden de fabricación.</w:t>
-      </w:r>
-    </w:p>
-    <w:p>
-      <w:pPr>
-        <w:rPr>
-          <w:b/>
-          <w:bCs/>
-        </w:rPr>
-      </w:pPr>
-    </w:p>
-    <w:p>
-      <w:pPr>
-        <w:rPr>
-          <w:b/>
-          <w:bCs/>
-        </w:rPr>
-      </w:pPr>
-      <w:r>
-        <w:rPr>
-          <w:b/>
-          <w:bCs/>
-        </w:rPr>
-        <w:br w:type="page"/>
-      </w:r>
-    </w:p>
-    <w:p>
-      <w:pPr>
-        <w:rPr>
-          <w:b/>
-          <w:bCs/>
-        </w:rPr>
       </w:pPr>
       <w:r>
         <w:rPr>
@@ -2043,34 +2404,50 @@
           <w:bCs/>
         </w:rPr>
         <w:lastRenderedPageBreak/>
-        <w:t>5. Glosario (LEL - Lenguaje Extendido del Lenguaje)</w:t>
+        <w:t>Validación de Stock:</w:t>
+      </w:r>
+      <w:r>
+        <w:t xml:space="preserve"> No se puede confirmar una venta de stock físico si la cantidad solicitada supera la disponible en depósito.</w:t>
       </w:r>
     </w:p>
     <w:p>
       <w:pPr>
         <w:numPr>
           <w:ilvl w:val="0"/>
-          <w:numId w:val="16"/>
+          <w:numId w:val="25"/>
         </w:numPr>
+      </w:pPr>
+      <w:r>
         <w:rPr>
           <w:b/>
           <w:bCs/>
         </w:rPr>
+        <w:t>Gestión de Pagos:</w:t>
+      </w:r>
+      <w:r>
+        <w:t xml:space="preserve"> No se podrá realizar una nueva orden de compra a un proveedor si el saldo adeudado supera el límite de crédito preestablecido.</w:t>
+      </w:r>
+    </w:p>
+    <w:p>
+      <w:pPr>
+        <w:numPr>
+          <w:ilvl w:val="0"/>
+          <w:numId w:val="25"/>
+        </w:numPr>
       </w:pPr>
       <w:r>
         <w:rPr>
           <w:b/>
           <w:bCs/>
         </w:rPr>
-        <w:t>Acero Inoxidable: Materia prima principal, clasificada por tipos (ej. AISI 304, 316) que determina el costo y uso del producto.</w:t>
+        <w:t>Confirmación de Producción:</w:t>
+      </w:r>
+      <w:r>
+        <w:t xml:space="preserve"> Todo producto "a pedido" debe registrar un pago de seña mínimo antes de habilitar la orden de fabricación.</w:t>
       </w:r>
     </w:p>
     <w:p>
       <w:pPr>
-        <w:numPr>
-          <w:ilvl w:val="0"/>
-          <w:numId w:val="16"/>
-        </w:numPr>
         <w:rPr>
           <w:b/>
           <w:bCs/>
@@ -2081,64 +2458,97 @@
           <w:b/>
           <w:bCs/>
         </w:rPr>
-        <w:t>Pedido a Pedido: Solicitud de un cliente para la fabricación de un objeto con medidas o características no estándar.</w:t>
+        <w:t>5. Glosario (LEL - Lenguaje Extendido del Lenguaje)</w:t>
       </w:r>
     </w:p>
     <w:p>
       <w:pPr>
         <w:numPr>
           <w:ilvl w:val="0"/>
-          <w:numId w:val="16"/>
+          <w:numId w:val="26"/>
         </w:numPr>
+      </w:pPr>
+      <w:r>
         <w:rPr>
           <w:b/>
           <w:bCs/>
         </w:rPr>
+        <w:t>Acero Inoxidable:</w:t>
+      </w:r>
+      <w:r>
+        <w:t xml:space="preserve"> Materia prima principal, clasificada por tipos (ej. AISI 304, 316) que determina el costo y uso del producto.</w:t>
+      </w:r>
+    </w:p>
+    <w:p>
+      <w:pPr>
+        <w:numPr>
+          <w:ilvl w:val="0"/>
+          <w:numId w:val="26"/>
+        </w:numPr>
       </w:pPr>
       <w:r>
         <w:rPr>
           <w:b/>
           <w:bCs/>
         </w:rPr>
-        <w:t>Orden de Fabricación (OF): Documento interno que autoriza al taller a consumir materia prima para crear un producto.</w:t>
+        <w:t>Pedido a Pedido:</w:t>
+      </w:r>
+      <w:r>
+        <w:t xml:space="preserve"> Solicitud de un cliente para la fabricación de un objeto con medidas o características no estándar.</w:t>
       </w:r>
     </w:p>
     <w:p>
       <w:pPr>
         <w:numPr>
           <w:ilvl w:val="0"/>
-          <w:numId w:val="16"/>
+          <w:numId w:val="26"/>
         </w:numPr>
+      </w:pPr>
+      <w:r>
         <w:rPr>
           <w:b/>
           <w:bCs/>
         </w:rPr>
+        <w:t>Orden de Fabricación (OF):</w:t>
+      </w:r>
+      <w:r>
+        <w:t xml:space="preserve"> Documento interno que autoriza al taller a consumir materia prima para crear un producto.</w:t>
+      </w:r>
+    </w:p>
+    <w:p>
+      <w:pPr>
+        <w:numPr>
+          <w:ilvl w:val="0"/>
+          <w:numId w:val="26"/>
+        </w:numPr>
       </w:pPr>
       <w:r>
         <w:rPr>
           <w:b/>
           <w:bCs/>
         </w:rPr>
-        <w:t>Insumo: Elementos necesarios para la producción (discos de corte, electrodos, planchas de acero).</w:t>
+        <w:t>Insumo:</w:t>
+      </w:r>
+      <w:r>
+        <w:t xml:space="preserve"> Elementos necesarios para la producción (discos de corte, electrodos, planchas de acero).</w:t>
       </w:r>
     </w:p>
     <w:p>
       <w:pPr>
         <w:numPr>
           <w:ilvl w:val="0"/>
-          <w:numId w:val="16"/>
+          <w:numId w:val="26"/>
         </w:numPr>
+      </w:pPr>
+      <w:r>
         <w:rPr>
           <w:b/>
           <w:bCs/>
         </w:rPr>
-      </w:pPr>
-      <w:r>
-        <w:rPr>
-          <w:b/>
-          <w:bCs/>
-        </w:rPr>
-        <w:t>Hoja de Ruta de Envío: Documento que contiene los datos del cliente y el transporte asignado para la entrega.</w:t>
+        <w:t>Hoja de Ruta de Envío:</w:t>
+      </w:r>
+      <w:r>
+        <w:t xml:space="preserve"> Documento que contiene los datos del cliente y el transporte asignado para la entrega.</w:t>
       </w:r>
     </w:p>
     <w:p/>
@@ -2155,6 +2565,155 @@
 <file path=word/numbering.xml><?xml version="1.0" encoding="utf-8"?>
 <w:numbering xmlns:wpc="http://schemas.microsoft.com/office/word/2010/wordprocessingCanvas" xmlns:cx="http://schemas.microsoft.com/office/drawing/2014/chartex" xmlns:cx1="http://schemas.microsoft.com/office/drawing/2015/9/8/chartex" xmlns:cx2="http://schemas.microsoft.com/office/drawing/2015/10/21/chartex" xmlns:cx3="http://schemas.microsoft.com/office/drawing/2016/5/9/chartex" xmlns:cx4="http://schemas.microsoft.com/office/drawing/2016/5/10/chartex" xmlns:cx5="http://schemas.microsoft.com/office/drawing/2016/5/11/chartex" xmlns:cx6="http://schemas.microsoft.com/office/drawing/2016/5/12/chartex" xmlns:cx7="http://schemas.microsoft.com/office/drawing/2016/5/13/chartex" xmlns:cx8="http://schemas.microsoft.com/office/drawing/2016/5/14/chartex" xmlns:mc="http://schemas.openxmlformats.org/markup-compatibility/2006" xmlns:aink="http://schemas.microsoft.com/office/drawing/2016/ink" xmlns:am3d="http://schemas.microsoft.com/office/drawing/2017/model3d" xmlns:o="urn:schemas-microsoft-com:office:office" xmlns:oel="http://schemas.microsoft.com/office/2019/extlst" xmlns:r="http://schemas.openxmlformats.org/officeDocument/2006/relationships" xmlns:m="http://schemas.openxmlformats.org/officeDocument/2006/math" xmlns:v="urn:schemas-microsoft-com:vml" xmlns:wp14="http://schemas.microsoft.com/office/word/2010/wordprocessingDrawing" xmlns:wp="http://schemas.openxmlformats.org/drawingml/2006/wordprocessingDrawing" xmlns:w10="urn:schemas-microsoft-com:office:word" xmlns:w="http://schemas.openxmlformats.org/wordprocessingml/2006/main" xmlns:w14="http://schemas.microsoft.com/office/word/2010/wordml" xmlns:w15="http://schemas.microsoft.com/office/word/2012/wordml" xmlns:w16cex="http://schemas.microsoft.com/office/word/2018/wordml/cex" xmlns:w16cid="http://schemas.microsoft.com/office/word/2016/wordml/cid" xmlns:w16="http://schemas.microsoft.com/office/word/2018/wordml" xmlns:w16du="http://schemas.microsoft.com/office/word/2023/wordml/word16du" xmlns:w16sdtdh="http://schemas.microsoft.com/office/word/2020/wordml/sdtdatahash" xmlns:w16sdtfl="http://schemas.microsoft.com/office/word/2024/wordml/sdtformatlock" xmlns:w16se="http://schemas.microsoft.com/office/word/2015/wordml/symex" xmlns:wpg="http://schemas.microsoft.com/office/word/2010/wordprocessingGroup" xmlns:wpi="http://schemas.microsoft.com/office/word/2010/wordprocessingInk" xmlns:wne="http://schemas.microsoft.com/office/word/2006/wordml" xmlns:wps="http://schemas.microsoft.com/office/word/2010/wordprocessingShape" mc:Ignorable="w14 w15 w16se w16cid w16 w16cex w16sdtdh w16sdtfl w16du wp14">
   <w:abstractNum w:abstractNumId="0" w15:restartNumberingAfterBreak="0">
+    <w:nsid w:val="06010777"/>
+    <w:multiLevelType w:val="multilevel"/>
+    <w:tmpl w:val="4170C040"/>
+    <w:lvl w:ilvl="0">
+      <w:start w:val="1"/>
+      <w:numFmt w:val="bullet"/>
+      <w:lvlText w:val=""/>
+      <w:lvlJc w:val="left"/>
+      <w:pPr>
+        <w:tabs>
+          <w:tab w:val="num" w:pos="720"/>
+        </w:tabs>
+        <w:ind w:left="720" w:hanging="360"/>
+      </w:pPr>
+      <w:rPr>
+        <w:rFonts w:ascii="Symbol" w:hAnsi="Symbol" w:hint="default"/>
+        <w:sz w:val="20"/>
+      </w:rPr>
+    </w:lvl>
+    <w:lvl w:ilvl="1" w:tentative="1">
+      <w:start w:val="1"/>
+      <w:numFmt w:val="bullet"/>
+      <w:lvlText w:val="o"/>
+      <w:lvlJc w:val="left"/>
+      <w:pPr>
+        <w:tabs>
+          <w:tab w:val="num" w:pos="1440"/>
+        </w:tabs>
+        <w:ind w:left="1440" w:hanging="360"/>
+      </w:pPr>
+      <w:rPr>
+        <w:rFonts w:ascii="Courier New" w:hAnsi="Courier New" w:hint="default"/>
+        <w:sz w:val="20"/>
+      </w:rPr>
+    </w:lvl>
+    <w:lvl w:ilvl="2" w:tentative="1">
+      <w:start w:val="1"/>
+      <w:numFmt w:val="bullet"/>
+      <w:lvlText w:val=""/>
+      <w:lvlJc w:val="left"/>
+      <w:pPr>
+        <w:tabs>
+          <w:tab w:val="num" w:pos="2160"/>
+        </w:tabs>
+        <w:ind w:left="2160" w:hanging="360"/>
+      </w:pPr>
+      <w:rPr>
+        <w:rFonts w:ascii="Wingdings" w:hAnsi="Wingdings" w:hint="default"/>
+        <w:sz w:val="20"/>
+      </w:rPr>
+    </w:lvl>
+    <w:lvl w:ilvl="3" w:tentative="1">
+      <w:start w:val="1"/>
+      <w:numFmt w:val="bullet"/>
+      <w:lvlText w:val=""/>
+      <w:lvlJc w:val="left"/>
+      <w:pPr>
+        <w:tabs>
+          <w:tab w:val="num" w:pos="2880"/>
+        </w:tabs>
+        <w:ind w:left="2880" w:hanging="360"/>
+      </w:pPr>
+      <w:rPr>
+        <w:rFonts w:ascii="Wingdings" w:hAnsi="Wingdings" w:hint="default"/>
+        <w:sz w:val="20"/>
+      </w:rPr>
+    </w:lvl>
+    <w:lvl w:ilvl="4" w:tentative="1">
+      <w:start w:val="1"/>
+      <w:numFmt w:val="bullet"/>
+      <w:lvlText w:val=""/>
+      <w:lvlJc w:val="left"/>
+      <w:pPr>
+        <w:tabs>
+          <w:tab w:val="num" w:pos="3600"/>
+        </w:tabs>
+        <w:ind w:left="3600" w:hanging="360"/>
+      </w:pPr>
+      <w:rPr>
+        <w:rFonts w:ascii="Wingdings" w:hAnsi="Wingdings" w:hint="default"/>
+        <w:sz w:val="20"/>
+      </w:rPr>
+    </w:lvl>
+    <w:lvl w:ilvl="5" w:tentative="1">
+      <w:start w:val="1"/>
+      <w:numFmt w:val="bullet"/>
+      <w:lvlText w:val=""/>
+      <w:lvlJc w:val="left"/>
+      <w:pPr>
+        <w:tabs>
+          <w:tab w:val="num" w:pos="4320"/>
+        </w:tabs>
+        <w:ind w:left="4320" w:hanging="360"/>
+      </w:pPr>
+      <w:rPr>
+        <w:rFonts w:ascii="Wingdings" w:hAnsi="Wingdings" w:hint="default"/>
+        <w:sz w:val="20"/>
+      </w:rPr>
+    </w:lvl>
+    <w:lvl w:ilvl="6" w:tentative="1">
+      <w:start w:val="1"/>
+      <w:numFmt w:val="bullet"/>
+      <w:lvlText w:val=""/>
+      <w:lvlJc w:val="left"/>
+      <w:pPr>
+        <w:tabs>
+          <w:tab w:val="num" w:pos="5040"/>
+        </w:tabs>
+        <w:ind w:left="5040" w:hanging="360"/>
+      </w:pPr>
+      <w:rPr>
+        <w:rFonts w:ascii="Wingdings" w:hAnsi="Wingdings" w:hint="default"/>
+        <w:sz w:val="20"/>
+      </w:rPr>
+    </w:lvl>
+    <w:lvl w:ilvl="7" w:tentative="1">
+      <w:start w:val="1"/>
+      <w:numFmt w:val="bullet"/>
+      <w:lvlText w:val=""/>
+      <w:lvlJc w:val="left"/>
+      <w:pPr>
+        <w:tabs>
+          <w:tab w:val="num" w:pos="5760"/>
+        </w:tabs>
+        <w:ind w:left="5760" w:hanging="360"/>
+      </w:pPr>
+      <w:rPr>
+        <w:rFonts w:ascii="Wingdings" w:hAnsi="Wingdings" w:hint="default"/>
+        <w:sz w:val="20"/>
+      </w:rPr>
+    </w:lvl>
+    <w:lvl w:ilvl="8" w:tentative="1">
+      <w:start w:val="1"/>
+      <w:numFmt w:val="bullet"/>
+      <w:lvlText w:val=""/>
+      <w:lvlJc w:val="left"/>
+      <w:pPr>
+        <w:tabs>
+          <w:tab w:val="num" w:pos="6480"/>
+        </w:tabs>
+        <w:ind w:left="6480" w:hanging="360"/>
+      </w:pPr>
+      <w:rPr>
+        <w:rFonts w:ascii="Wingdings" w:hAnsi="Wingdings" w:hint="default"/>
+        <w:sz w:val="20"/>
+      </w:rPr>
+    </w:lvl>
+  </w:abstractNum>
+  <w:abstractNum w:abstractNumId="1" w15:restartNumberingAfterBreak="0">
     <w:nsid w:val="06F9395A"/>
     <w:multiLevelType w:val="multilevel"/>
     <w:tmpl w:val="DD500434"/>
@@ -2303,7 +2862,454 @@
       </w:rPr>
     </w:lvl>
   </w:abstractNum>
-  <w:abstractNum w:abstractNumId="1" w15:restartNumberingAfterBreak="0">
+  <w:abstractNum w:abstractNumId="2" w15:restartNumberingAfterBreak="0">
+    <w:nsid w:val="07504714"/>
+    <w:multiLevelType w:val="multilevel"/>
+    <w:tmpl w:val="284E82E6"/>
+    <w:lvl w:ilvl="0">
+      <w:start w:val="1"/>
+      <w:numFmt w:val="bullet"/>
+      <w:lvlText w:val=""/>
+      <w:lvlJc w:val="left"/>
+      <w:pPr>
+        <w:tabs>
+          <w:tab w:val="num" w:pos="720"/>
+        </w:tabs>
+        <w:ind w:left="720" w:hanging="360"/>
+      </w:pPr>
+      <w:rPr>
+        <w:rFonts w:ascii="Symbol" w:hAnsi="Symbol" w:hint="default"/>
+        <w:sz w:val="20"/>
+      </w:rPr>
+    </w:lvl>
+    <w:lvl w:ilvl="1" w:tentative="1">
+      <w:start w:val="1"/>
+      <w:numFmt w:val="bullet"/>
+      <w:lvlText w:val="o"/>
+      <w:lvlJc w:val="left"/>
+      <w:pPr>
+        <w:tabs>
+          <w:tab w:val="num" w:pos="1440"/>
+        </w:tabs>
+        <w:ind w:left="1440" w:hanging="360"/>
+      </w:pPr>
+      <w:rPr>
+        <w:rFonts w:ascii="Courier New" w:hAnsi="Courier New" w:hint="default"/>
+        <w:sz w:val="20"/>
+      </w:rPr>
+    </w:lvl>
+    <w:lvl w:ilvl="2" w:tentative="1">
+      <w:start w:val="1"/>
+      <w:numFmt w:val="bullet"/>
+      <w:lvlText w:val=""/>
+      <w:lvlJc w:val="left"/>
+      <w:pPr>
+        <w:tabs>
+          <w:tab w:val="num" w:pos="2160"/>
+        </w:tabs>
+        <w:ind w:left="2160" w:hanging="360"/>
+      </w:pPr>
+      <w:rPr>
+        <w:rFonts w:ascii="Wingdings" w:hAnsi="Wingdings" w:hint="default"/>
+        <w:sz w:val="20"/>
+      </w:rPr>
+    </w:lvl>
+    <w:lvl w:ilvl="3" w:tentative="1">
+      <w:start w:val="1"/>
+      <w:numFmt w:val="bullet"/>
+      <w:lvlText w:val=""/>
+      <w:lvlJc w:val="left"/>
+      <w:pPr>
+        <w:tabs>
+          <w:tab w:val="num" w:pos="2880"/>
+        </w:tabs>
+        <w:ind w:left="2880" w:hanging="360"/>
+      </w:pPr>
+      <w:rPr>
+        <w:rFonts w:ascii="Wingdings" w:hAnsi="Wingdings" w:hint="default"/>
+        <w:sz w:val="20"/>
+      </w:rPr>
+    </w:lvl>
+    <w:lvl w:ilvl="4" w:tentative="1">
+      <w:start w:val="1"/>
+      <w:numFmt w:val="bullet"/>
+      <w:lvlText w:val=""/>
+      <w:lvlJc w:val="left"/>
+      <w:pPr>
+        <w:tabs>
+          <w:tab w:val="num" w:pos="3600"/>
+        </w:tabs>
+        <w:ind w:left="3600" w:hanging="360"/>
+      </w:pPr>
+      <w:rPr>
+        <w:rFonts w:ascii="Wingdings" w:hAnsi="Wingdings" w:hint="default"/>
+        <w:sz w:val="20"/>
+      </w:rPr>
+    </w:lvl>
+    <w:lvl w:ilvl="5" w:tentative="1">
+      <w:start w:val="1"/>
+      <w:numFmt w:val="bullet"/>
+      <w:lvlText w:val=""/>
+      <w:lvlJc w:val="left"/>
+      <w:pPr>
+        <w:tabs>
+          <w:tab w:val="num" w:pos="4320"/>
+        </w:tabs>
+        <w:ind w:left="4320" w:hanging="360"/>
+      </w:pPr>
+      <w:rPr>
+        <w:rFonts w:ascii="Wingdings" w:hAnsi="Wingdings" w:hint="default"/>
+        <w:sz w:val="20"/>
+      </w:rPr>
+    </w:lvl>
+    <w:lvl w:ilvl="6" w:tentative="1">
+      <w:start w:val="1"/>
+      <w:numFmt w:val="bullet"/>
+      <w:lvlText w:val=""/>
+      <w:lvlJc w:val="left"/>
+      <w:pPr>
+        <w:tabs>
+          <w:tab w:val="num" w:pos="5040"/>
+        </w:tabs>
+        <w:ind w:left="5040" w:hanging="360"/>
+      </w:pPr>
+      <w:rPr>
+        <w:rFonts w:ascii="Wingdings" w:hAnsi="Wingdings" w:hint="default"/>
+        <w:sz w:val="20"/>
+      </w:rPr>
+    </w:lvl>
+    <w:lvl w:ilvl="7" w:tentative="1">
+      <w:start w:val="1"/>
+      <w:numFmt w:val="bullet"/>
+      <w:lvlText w:val=""/>
+      <w:lvlJc w:val="left"/>
+      <w:pPr>
+        <w:tabs>
+          <w:tab w:val="num" w:pos="5760"/>
+        </w:tabs>
+        <w:ind w:left="5760" w:hanging="360"/>
+      </w:pPr>
+      <w:rPr>
+        <w:rFonts w:ascii="Wingdings" w:hAnsi="Wingdings" w:hint="default"/>
+        <w:sz w:val="20"/>
+      </w:rPr>
+    </w:lvl>
+    <w:lvl w:ilvl="8" w:tentative="1">
+      <w:start w:val="1"/>
+      <w:numFmt w:val="bullet"/>
+      <w:lvlText w:val=""/>
+      <w:lvlJc w:val="left"/>
+      <w:pPr>
+        <w:tabs>
+          <w:tab w:val="num" w:pos="6480"/>
+        </w:tabs>
+        <w:ind w:left="6480" w:hanging="360"/>
+      </w:pPr>
+      <w:rPr>
+        <w:rFonts w:ascii="Wingdings" w:hAnsi="Wingdings" w:hint="default"/>
+        <w:sz w:val="20"/>
+      </w:rPr>
+    </w:lvl>
+  </w:abstractNum>
+  <w:abstractNum w:abstractNumId="3" w15:restartNumberingAfterBreak="0">
+    <w:nsid w:val="0B9E664E"/>
+    <w:multiLevelType w:val="multilevel"/>
+    <w:tmpl w:val="00FAD0B6"/>
+    <w:lvl w:ilvl="0">
+      <w:start w:val="1"/>
+      <w:numFmt w:val="bullet"/>
+      <w:lvlText w:val=""/>
+      <w:lvlJc w:val="left"/>
+      <w:pPr>
+        <w:tabs>
+          <w:tab w:val="num" w:pos="720"/>
+        </w:tabs>
+        <w:ind w:left="720" w:hanging="360"/>
+      </w:pPr>
+      <w:rPr>
+        <w:rFonts w:ascii="Symbol" w:hAnsi="Symbol" w:hint="default"/>
+        <w:sz w:val="20"/>
+      </w:rPr>
+    </w:lvl>
+    <w:lvl w:ilvl="1" w:tentative="1">
+      <w:start w:val="1"/>
+      <w:numFmt w:val="bullet"/>
+      <w:lvlText w:val="o"/>
+      <w:lvlJc w:val="left"/>
+      <w:pPr>
+        <w:tabs>
+          <w:tab w:val="num" w:pos="1440"/>
+        </w:tabs>
+        <w:ind w:left="1440" w:hanging="360"/>
+      </w:pPr>
+      <w:rPr>
+        <w:rFonts w:ascii="Courier New" w:hAnsi="Courier New" w:hint="default"/>
+        <w:sz w:val="20"/>
+      </w:rPr>
+    </w:lvl>
+    <w:lvl w:ilvl="2" w:tentative="1">
+      <w:start w:val="1"/>
+      <w:numFmt w:val="bullet"/>
+      <w:lvlText w:val=""/>
+      <w:lvlJc w:val="left"/>
+      <w:pPr>
+        <w:tabs>
+          <w:tab w:val="num" w:pos="2160"/>
+        </w:tabs>
+        <w:ind w:left="2160" w:hanging="360"/>
+      </w:pPr>
+      <w:rPr>
+        <w:rFonts w:ascii="Wingdings" w:hAnsi="Wingdings" w:hint="default"/>
+        <w:sz w:val="20"/>
+      </w:rPr>
+    </w:lvl>
+    <w:lvl w:ilvl="3" w:tentative="1">
+      <w:start w:val="1"/>
+      <w:numFmt w:val="bullet"/>
+      <w:lvlText w:val=""/>
+      <w:lvlJc w:val="left"/>
+      <w:pPr>
+        <w:tabs>
+          <w:tab w:val="num" w:pos="2880"/>
+        </w:tabs>
+        <w:ind w:left="2880" w:hanging="360"/>
+      </w:pPr>
+      <w:rPr>
+        <w:rFonts w:ascii="Wingdings" w:hAnsi="Wingdings" w:hint="default"/>
+        <w:sz w:val="20"/>
+      </w:rPr>
+    </w:lvl>
+    <w:lvl w:ilvl="4" w:tentative="1">
+      <w:start w:val="1"/>
+      <w:numFmt w:val="bullet"/>
+      <w:lvlText w:val=""/>
+      <w:lvlJc w:val="left"/>
+      <w:pPr>
+        <w:tabs>
+          <w:tab w:val="num" w:pos="3600"/>
+        </w:tabs>
+        <w:ind w:left="3600" w:hanging="360"/>
+      </w:pPr>
+      <w:rPr>
+        <w:rFonts w:ascii="Wingdings" w:hAnsi="Wingdings" w:hint="default"/>
+        <w:sz w:val="20"/>
+      </w:rPr>
+    </w:lvl>
+    <w:lvl w:ilvl="5" w:tentative="1">
+      <w:start w:val="1"/>
+      <w:numFmt w:val="bullet"/>
+      <w:lvlText w:val=""/>
+      <w:lvlJc w:val="left"/>
+      <w:pPr>
+        <w:tabs>
+          <w:tab w:val="num" w:pos="4320"/>
+        </w:tabs>
+        <w:ind w:left="4320" w:hanging="360"/>
+      </w:pPr>
+      <w:rPr>
+        <w:rFonts w:ascii="Wingdings" w:hAnsi="Wingdings" w:hint="default"/>
+        <w:sz w:val="20"/>
+      </w:rPr>
+    </w:lvl>
+    <w:lvl w:ilvl="6" w:tentative="1">
+      <w:start w:val="1"/>
+      <w:numFmt w:val="bullet"/>
+      <w:lvlText w:val=""/>
+      <w:lvlJc w:val="left"/>
+      <w:pPr>
+        <w:tabs>
+          <w:tab w:val="num" w:pos="5040"/>
+        </w:tabs>
+        <w:ind w:left="5040" w:hanging="360"/>
+      </w:pPr>
+      <w:rPr>
+        <w:rFonts w:ascii="Wingdings" w:hAnsi="Wingdings" w:hint="default"/>
+        <w:sz w:val="20"/>
+      </w:rPr>
+    </w:lvl>
+    <w:lvl w:ilvl="7" w:tentative="1">
+      <w:start w:val="1"/>
+      <w:numFmt w:val="bullet"/>
+      <w:lvlText w:val=""/>
+      <w:lvlJc w:val="left"/>
+      <w:pPr>
+        <w:tabs>
+          <w:tab w:val="num" w:pos="5760"/>
+        </w:tabs>
+        <w:ind w:left="5760" w:hanging="360"/>
+      </w:pPr>
+      <w:rPr>
+        <w:rFonts w:ascii="Wingdings" w:hAnsi="Wingdings" w:hint="default"/>
+        <w:sz w:val="20"/>
+      </w:rPr>
+    </w:lvl>
+    <w:lvl w:ilvl="8" w:tentative="1">
+      <w:start w:val="1"/>
+      <w:numFmt w:val="bullet"/>
+      <w:lvlText w:val=""/>
+      <w:lvlJc w:val="left"/>
+      <w:pPr>
+        <w:tabs>
+          <w:tab w:val="num" w:pos="6480"/>
+        </w:tabs>
+        <w:ind w:left="6480" w:hanging="360"/>
+      </w:pPr>
+      <w:rPr>
+        <w:rFonts w:ascii="Wingdings" w:hAnsi="Wingdings" w:hint="default"/>
+        <w:sz w:val="20"/>
+      </w:rPr>
+    </w:lvl>
+  </w:abstractNum>
+  <w:abstractNum w:abstractNumId="4" w15:restartNumberingAfterBreak="0">
+    <w:nsid w:val="11C97965"/>
+    <w:multiLevelType w:val="multilevel"/>
+    <w:tmpl w:val="BED2FDF6"/>
+    <w:lvl w:ilvl="0">
+      <w:start w:val="1"/>
+      <w:numFmt w:val="bullet"/>
+      <w:lvlText w:val=""/>
+      <w:lvlJc w:val="left"/>
+      <w:pPr>
+        <w:tabs>
+          <w:tab w:val="num" w:pos="720"/>
+        </w:tabs>
+        <w:ind w:left="720" w:hanging="360"/>
+      </w:pPr>
+      <w:rPr>
+        <w:rFonts w:ascii="Symbol" w:hAnsi="Symbol" w:hint="default"/>
+        <w:sz w:val="20"/>
+      </w:rPr>
+    </w:lvl>
+    <w:lvl w:ilvl="1" w:tentative="1">
+      <w:start w:val="1"/>
+      <w:numFmt w:val="bullet"/>
+      <w:lvlText w:val="o"/>
+      <w:lvlJc w:val="left"/>
+      <w:pPr>
+        <w:tabs>
+          <w:tab w:val="num" w:pos="1440"/>
+        </w:tabs>
+        <w:ind w:left="1440" w:hanging="360"/>
+      </w:pPr>
+      <w:rPr>
+        <w:rFonts w:ascii="Courier New" w:hAnsi="Courier New" w:hint="default"/>
+        <w:sz w:val="20"/>
+      </w:rPr>
+    </w:lvl>
+    <w:lvl w:ilvl="2" w:tentative="1">
+      <w:start w:val="1"/>
+      <w:numFmt w:val="bullet"/>
+      <w:lvlText w:val=""/>
+      <w:lvlJc w:val="left"/>
+      <w:pPr>
+        <w:tabs>
+          <w:tab w:val="num" w:pos="2160"/>
+        </w:tabs>
+        <w:ind w:left="2160" w:hanging="360"/>
+      </w:pPr>
+      <w:rPr>
+        <w:rFonts w:ascii="Wingdings" w:hAnsi="Wingdings" w:hint="default"/>
+        <w:sz w:val="20"/>
+      </w:rPr>
+    </w:lvl>
+    <w:lvl w:ilvl="3" w:tentative="1">
+      <w:start w:val="1"/>
+      <w:numFmt w:val="bullet"/>
+      <w:lvlText w:val=""/>
+      <w:lvlJc w:val="left"/>
+      <w:pPr>
+        <w:tabs>
+          <w:tab w:val="num" w:pos="2880"/>
+        </w:tabs>
+        <w:ind w:left="2880" w:hanging="360"/>
+      </w:pPr>
+      <w:rPr>
+        <w:rFonts w:ascii="Wingdings" w:hAnsi="Wingdings" w:hint="default"/>
+        <w:sz w:val="20"/>
+      </w:rPr>
+    </w:lvl>
+    <w:lvl w:ilvl="4" w:tentative="1">
+      <w:start w:val="1"/>
+      <w:numFmt w:val="bullet"/>
+      <w:lvlText w:val=""/>
+      <w:lvlJc w:val="left"/>
+      <w:pPr>
+        <w:tabs>
+          <w:tab w:val="num" w:pos="3600"/>
+        </w:tabs>
+        <w:ind w:left="3600" w:hanging="360"/>
+      </w:pPr>
+      <w:rPr>
+        <w:rFonts w:ascii="Wingdings" w:hAnsi="Wingdings" w:hint="default"/>
+        <w:sz w:val="20"/>
+      </w:rPr>
+    </w:lvl>
+    <w:lvl w:ilvl="5" w:tentative="1">
+      <w:start w:val="1"/>
+      <w:numFmt w:val="bullet"/>
+      <w:lvlText w:val=""/>
+      <w:lvlJc w:val="left"/>
+      <w:pPr>
+        <w:tabs>
+          <w:tab w:val="num" w:pos="4320"/>
+        </w:tabs>
+        <w:ind w:left="4320" w:hanging="360"/>
+      </w:pPr>
+      <w:rPr>
+        <w:rFonts w:ascii="Wingdings" w:hAnsi="Wingdings" w:hint="default"/>
+        <w:sz w:val="20"/>
+      </w:rPr>
+    </w:lvl>
+    <w:lvl w:ilvl="6" w:tentative="1">
+      <w:start w:val="1"/>
+      <w:numFmt w:val="bullet"/>
+      <w:lvlText w:val=""/>
+      <w:lvlJc w:val="left"/>
+      <w:pPr>
+        <w:tabs>
+          <w:tab w:val="num" w:pos="5040"/>
+        </w:tabs>
+        <w:ind w:left="5040" w:hanging="360"/>
+      </w:pPr>
+      <w:rPr>
+        <w:rFonts w:ascii="Wingdings" w:hAnsi="Wingdings" w:hint="default"/>
+        <w:sz w:val="20"/>
+      </w:rPr>
+    </w:lvl>
+    <w:lvl w:ilvl="7" w:tentative="1">
+      <w:start w:val="1"/>
+      <w:numFmt w:val="bullet"/>
+      <w:lvlText w:val=""/>
+      <w:lvlJc w:val="left"/>
+      <w:pPr>
+        <w:tabs>
+          <w:tab w:val="num" w:pos="5760"/>
+        </w:tabs>
+        <w:ind w:left="5760" w:hanging="360"/>
+      </w:pPr>
+      <w:rPr>
+        <w:rFonts w:ascii="Wingdings" w:hAnsi="Wingdings" w:hint="default"/>
+        <w:sz w:val="20"/>
+      </w:rPr>
+    </w:lvl>
+    <w:lvl w:ilvl="8" w:tentative="1">
+      <w:start w:val="1"/>
+      <w:numFmt w:val="bullet"/>
+      <w:lvlText w:val=""/>
+      <w:lvlJc w:val="left"/>
+      <w:pPr>
+        <w:tabs>
+          <w:tab w:val="num" w:pos="6480"/>
+        </w:tabs>
+        <w:ind w:left="6480" w:hanging="360"/>
+      </w:pPr>
+      <w:rPr>
+        <w:rFonts w:ascii="Wingdings" w:hAnsi="Wingdings" w:hint="default"/>
+        <w:sz w:val="20"/>
+      </w:rPr>
+    </w:lvl>
+  </w:abstractNum>
+  <w:abstractNum w:abstractNumId="5" w15:restartNumberingAfterBreak="0">
     <w:nsid w:val="1EA25FDB"/>
     <w:multiLevelType w:val="multilevel"/>
     <w:tmpl w:val="21841D0E"/>
@@ -2452,7 +3458,156 @@
       </w:rPr>
     </w:lvl>
   </w:abstractNum>
-  <w:abstractNum w:abstractNumId="2" w15:restartNumberingAfterBreak="0">
+  <w:abstractNum w:abstractNumId="6" w15:restartNumberingAfterBreak="0">
+    <w:nsid w:val="2B8C628A"/>
+    <w:multiLevelType w:val="multilevel"/>
+    <w:tmpl w:val="41EC55D2"/>
+    <w:lvl w:ilvl="0">
+      <w:start w:val="1"/>
+      <w:numFmt w:val="bullet"/>
+      <w:lvlText w:val=""/>
+      <w:lvlJc w:val="left"/>
+      <w:pPr>
+        <w:tabs>
+          <w:tab w:val="num" w:pos="720"/>
+        </w:tabs>
+        <w:ind w:left="720" w:hanging="360"/>
+      </w:pPr>
+      <w:rPr>
+        <w:rFonts w:ascii="Symbol" w:hAnsi="Symbol" w:hint="default"/>
+        <w:sz w:val="20"/>
+      </w:rPr>
+    </w:lvl>
+    <w:lvl w:ilvl="1" w:tentative="1">
+      <w:start w:val="1"/>
+      <w:numFmt w:val="bullet"/>
+      <w:lvlText w:val="o"/>
+      <w:lvlJc w:val="left"/>
+      <w:pPr>
+        <w:tabs>
+          <w:tab w:val="num" w:pos="1440"/>
+        </w:tabs>
+        <w:ind w:left="1440" w:hanging="360"/>
+      </w:pPr>
+      <w:rPr>
+        <w:rFonts w:ascii="Courier New" w:hAnsi="Courier New" w:hint="default"/>
+        <w:sz w:val="20"/>
+      </w:rPr>
+    </w:lvl>
+    <w:lvl w:ilvl="2" w:tentative="1">
+      <w:start w:val="1"/>
+      <w:numFmt w:val="bullet"/>
+      <w:lvlText w:val=""/>
+      <w:lvlJc w:val="left"/>
+      <w:pPr>
+        <w:tabs>
+          <w:tab w:val="num" w:pos="2160"/>
+        </w:tabs>
+        <w:ind w:left="2160" w:hanging="360"/>
+      </w:pPr>
+      <w:rPr>
+        <w:rFonts w:ascii="Wingdings" w:hAnsi="Wingdings" w:hint="default"/>
+        <w:sz w:val="20"/>
+      </w:rPr>
+    </w:lvl>
+    <w:lvl w:ilvl="3" w:tentative="1">
+      <w:start w:val="1"/>
+      <w:numFmt w:val="bullet"/>
+      <w:lvlText w:val=""/>
+      <w:lvlJc w:val="left"/>
+      <w:pPr>
+        <w:tabs>
+          <w:tab w:val="num" w:pos="2880"/>
+        </w:tabs>
+        <w:ind w:left="2880" w:hanging="360"/>
+      </w:pPr>
+      <w:rPr>
+        <w:rFonts w:ascii="Wingdings" w:hAnsi="Wingdings" w:hint="default"/>
+        <w:sz w:val="20"/>
+      </w:rPr>
+    </w:lvl>
+    <w:lvl w:ilvl="4" w:tentative="1">
+      <w:start w:val="1"/>
+      <w:numFmt w:val="bullet"/>
+      <w:lvlText w:val=""/>
+      <w:lvlJc w:val="left"/>
+      <w:pPr>
+        <w:tabs>
+          <w:tab w:val="num" w:pos="3600"/>
+        </w:tabs>
+        <w:ind w:left="3600" w:hanging="360"/>
+      </w:pPr>
+      <w:rPr>
+        <w:rFonts w:ascii="Wingdings" w:hAnsi="Wingdings" w:hint="default"/>
+        <w:sz w:val="20"/>
+      </w:rPr>
+    </w:lvl>
+    <w:lvl w:ilvl="5" w:tentative="1">
+      <w:start w:val="1"/>
+      <w:numFmt w:val="bullet"/>
+      <w:lvlText w:val=""/>
+      <w:lvlJc w:val="left"/>
+      <w:pPr>
+        <w:tabs>
+          <w:tab w:val="num" w:pos="4320"/>
+        </w:tabs>
+        <w:ind w:left="4320" w:hanging="360"/>
+      </w:pPr>
+      <w:rPr>
+        <w:rFonts w:ascii="Wingdings" w:hAnsi="Wingdings" w:hint="default"/>
+        <w:sz w:val="20"/>
+      </w:rPr>
+    </w:lvl>
+    <w:lvl w:ilvl="6" w:tentative="1">
+      <w:start w:val="1"/>
+      <w:numFmt w:val="bullet"/>
+      <w:lvlText w:val=""/>
+      <w:lvlJc w:val="left"/>
+      <w:pPr>
+        <w:tabs>
+          <w:tab w:val="num" w:pos="5040"/>
+        </w:tabs>
+        <w:ind w:left="5040" w:hanging="360"/>
+      </w:pPr>
+      <w:rPr>
+        <w:rFonts w:ascii="Wingdings" w:hAnsi="Wingdings" w:hint="default"/>
+        <w:sz w:val="20"/>
+      </w:rPr>
+    </w:lvl>
+    <w:lvl w:ilvl="7" w:tentative="1">
+      <w:start w:val="1"/>
+      <w:numFmt w:val="bullet"/>
+      <w:lvlText w:val=""/>
+      <w:lvlJc w:val="left"/>
+      <w:pPr>
+        <w:tabs>
+          <w:tab w:val="num" w:pos="5760"/>
+        </w:tabs>
+        <w:ind w:left="5760" w:hanging="360"/>
+      </w:pPr>
+      <w:rPr>
+        <w:rFonts w:ascii="Wingdings" w:hAnsi="Wingdings" w:hint="default"/>
+        <w:sz w:val="20"/>
+      </w:rPr>
+    </w:lvl>
+    <w:lvl w:ilvl="8" w:tentative="1">
+      <w:start w:val="1"/>
+      <w:numFmt w:val="bullet"/>
+      <w:lvlText w:val=""/>
+      <w:lvlJc w:val="left"/>
+      <w:pPr>
+        <w:tabs>
+          <w:tab w:val="num" w:pos="6480"/>
+        </w:tabs>
+        <w:ind w:left="6480" w:hanging="360"/>
+      </w:pPr>
+      <w:rPr>
+        <w:rFonts w:ascii="Wingdings" w:hAnsi="Wingdings" w:hint="default"/>
+        <w:sz w:val="20"/>
+      </w:rPr>
+    </w:lvl>
+  </w:abstractNum>
+  <w:abstractNum w:abstractNumId="7" w15:restartNumberingAfterBreak="0">
     <w:nsid w:val="340B5315"/>
     <w:multiLevelType w:val="multilevel"/>
     <w:tmpl w:val="3D34665E"/>
@@ -2601,7 +3756,7 @@
       </w:rPr>
     </w:lvl>
   </w:abstractNum>
-  <w:abstractNum w:abstractNumId="3" w15:restartNumberingAfterBreak="0">
+  <w:abstractNum w:abstractNumId="8" w15:restartNumberingAfterBreak="0">
     <w:nsid w:val="34CE762C"/>
     <w:multiLevelType w:val="multilevel"/>
     <w:tmpl w:val="ADE25CCE"/>
@@ -2750,7 +3905,151 @@
       </w:rPr>
     </w:lvl>
   </w:abstractNum>
-  <w:abstractNum w:abstractNumId="4" w15:restartNumberingAfterBreak="0">
+  <w:abstractNum w:abstractNumId="9" w15:restartNumberingAfterBreak="0">
+    <w:nsid w:val="371434F1"/>
+    <w:multiLevelType w:val="multilevel"/>
+    <w:tmpl w:val="E92280D0"/>
+    <w:lvl w:ilvl="0">
+      <w:start w:val="1"/>
+      <w:numFmt w:val="bullet"/>
+      <w:lvlText w:val=""/>
+      <w:lvlJc w:val="left"/>
+      <w:pPr>
+        <w:tabs>
+          <w:tab w:val="num" w:pos="720"/>
+        </w:tabs>
+        <w:ind w:left="720" w:hanging="360"/>
+      </w:pPr>
+      <w:rPr>
+        <w:rFonts w:ascii="Symbol" w:hAnsi="Symbol" w:hint="default"/>
+        <w:sz w:val="20"/>
+      </w:rPr>
+    </w:lvl>
+    <w:lvl w:ilvl="1">
+      <w:numFmt w:val="bullet"/>
+      <w:lvlText w:val="-"/>
+      <w:lvlJc w:val="left"/>
+      <w:pPr>
+        <w:ind w:left="1440" w:hanging="360"/>
+      </w:pPr>
+      <w:rPr>
+        <w:rFonts w:ascii="Aptos" w:eastAsiaTheme="minorHAnsi" w:hAnsi="Aptos" w:cstheme="minorBidi" w:hint="default"/>
+      </w:rPr>
+    </w:lvl>
+    <w:lvl w:ilvl="2" w:tentative="1">
+      <w:start w:val="1"/>
+      <w:numFmt w:val="bullet"/>
+      <w:lvlText w:val=""/>
+      <w:lvlJc w:val="left"/>
+      <w:pPr>
+        <w:tabs>
+          <w:tab w:val="num" w:pos="2160"/>
+        </w:tabs>
+        <w:ind w:left="2160" w:hanging="360"/>
+      </w:pPr>
+      <w:rPr>
+        <w:rFonts w:ascii="Wingdings" w:hAnsi="Wingdings" w:hint="default"/>
+        <w:sz w:val="20"/>
+      </w:rPr>
+    </w:lvl>
+    <w:lvl w:ilvl="3" w:tentative="1">
+      <w:start w:val="1"/>
+      <w:numFmt w:val="bullet"/>
+      <w:lvlText w:val=""/>
+      <w:lvlJc w:val="left"/>
+      <w:pPr>
+        <w:tabs>
+          <w:tab w:val="num" w:pos="2880"/>
+        </w:tabs>
+        <w:ind w:left="2880" w:hanging="360"/>
+      </w:pPr>
+      <w:rPr>
+        <w:rFonts w:ascii="Wingdings" w:hAnsi="Wingdings" w:hint="default"/>
+        <w:sz w:val="20"/>
+      </w:rPr>
+    </w:lvl>
+    <w:lvl w:ilvl="4" w:tentative="1">
+      <w:start w:val="1"/>
+      <w:numFmt w:val="bullet"/>
+      <w:lvlText w:val=""/>
+      <w:lvlJc w:val="left"/>
+      <w:pPr>
+        <w:tabs>
+          <w:tab w:val="num" w:pos="3600"/>
+        </w:tabs>
+        <w:ind w:left="3600" w:hanging="360"/>
+      </w:pPr>
+      <w:rPr>
+        <w:rFonts w:ascii="Wingdings" w:hAnsi="Wingdings" w:hint="default"/>
+        <w:sz w:val="20"/>
+      </w:rPr>
+    </w:lvl>
+    <w:lvl w:ilvl="5" w:tentative="1">
+      <w:start w:val="1"/>
+      <w:numFmt w:val="bullet"/>
+      <w:lvlText w:val=""/>
+      <w:lvlJc w:val="left"/>
+      <w:pPr>
+        <w:tabs>
+          <w:tab w:val="num" w:pos="4320"/>
+        </w:tabs>
+        <w:ind w:left="4320" w:hanging="360"/>
+      </w:pPr>
+      <w:rPr>
+        <w:rFonts w:ascii="Wingdings" w:hAnsi="Wingdings" w:hint="default"/>
+        <w:sz w:val="20"/>
+      </w:rPr>
+    </w:lvl>
+    <w:lvl w:ilvl="6" w:tentative="1">
+      <w:start w:val="1"/>
+      <w:numFmt w:val="bullet"/>
+      <w:lvlText w:val=""/>
+      <w:lvlJc w:val="left"/>
+      <w:pPr>
+        <w:tabs>
+          <w:tab w:val="num" w:pos="5040"/>
+        </w:tabs>
+        <w:ind w:left="5040" w:hanging="360"/>
+      </w:pPr>
+      <w:rPr>
+        <w:rFonts w:ascii="Wingdings" w:hAnsi="Wingdings" w:hint="default"/>
+        <w:sz w:val="20"/>
+      </w:rPr>
+    </w:lvl>
+    <w:lvl w:ilvl="7" w:tentative="1">
+      <w:start w:val="1"/>
+      <w:numFmt w:val="bullet"/>
+      <w:lvlText w:val=""/>
+      <w:lvlJc w:val="left"/>
+      <w:pPr>
+        <w:tabs>
+          <w:tab w:val="num" w:pos="5760"/>
+        </w:tabs>
+        <w:ind w:left="5760" w:hanging="360"/>
+      </w:pPr>
+      <w:rPr>
+        <w:rFonts w:ascii="Wingdings" w:hAnsi="Wingdings" w:hint="default"/>
+        <w:sz w:val="20"/>
+      </w:rPr>
+    </w:lvl>
+    <w:lvl w:ilvl="8" w:tentative="1">
+      <w:start w:val="1"/>
+      <w:numFmt w:val="bullet"/>
+      <w:lvlText w:val=""/>
+      <w:lvlJc w:val="left"/>
+      <w:pPr>
+        <w:tabs>
+          <w:tab w:val="num" w:pos="6480"/>
+        </w:tabs>
+        <w:ind w:left="6480" w:hanging="360"/>
+      </w:pPr>
+      <w:rPr>
+        <w:rFonts w:ascii="Wingdings" w:hAnsi="Wingdings" w:hint="default"/>
+        <w:sz w:val="20"/>
+      </w:rPr>
+    </w:lvl>
+  </w:abstractNum>
+  <w:abstractNum w:abstractNumId="10" w15:restartNumberingAfterBreak="0">
     <w:nsid w:val="3D9F459D"/>
     <w:multiLevelType w:val="multilevel"/>
     <w:tmpl w:val="CEB6C2AE"/>
@@ -2899,7 +4198,7 @@
       </w:rPr>
     </w:lvl>
   </w:abstractNum>
-  <w:abstractNum w:abstractNumId="5" w15:restartNumberingAfterBreak="0">
+  <w:abstractNum w:abstractNumId="11" w15:restartNumberingAfterBreak="0">
     <w:nsid w:val="41BC0743"/>
     <w:multiLevelType w:val="multilevel"/>
     <w:tmpl w:val="8C10DD06"/>
@@ -3048,7 +4347,7 @@
       </w:rPr>
     </w:lvl>
   </w:abstractNum>
-  <w:abstractNum w:abstractNumId="6" w15:restartNumberingAfterBreak="0">
+  <w:abstractNum w:abstractNumId="12" w15:restartNumberingAfterBreak="0">
     <w:nsid w:val="4A42042B"/>
     <w:multiLevelType w:val="multilevel"/>
     <w:tmpl w:val="4C18B7B8"/>
@@ -3197,7 +4496,7 @@
       </w:rPr>
     </w:lvl>
   </w:abstractNum>
-  <w:abstractNum w:abstractNumId="7" w15:restartNumberingAfterBreak="0">
+  <w:abstractNum w:abstractNumId="13" w15:restartNumberingAfterBreak="0">
     <w:nsid w:val="5113066A"/>
     <w:multiLevelType w:val="multilevel"/>
     <w:tmpl w:val="A498DA2E"/>
@@ -3346,7 +4645,7 @@
       </w:rPr>
     </w:lvl>
   </w:abstractNum>
-  <w:abstractNum w:abstractNumId="8" w15:restartNumberingAfterBreak="0">
+  <w:abstractNum w:abstractNumId="14" w15:restartNumberingAfterBreak="0">
     <w:nsid w:val="54F62CBC"/>
     <w:multiLevelType w:val="multilevel"/>
     <w:tmpl w:val="E078E88C"/>
@@ -3459,7 +4758,305 @@
       </w:pPr>
     </w:lvl>
   </w:abstractNum>
-  <w:abstractNum w:abstractNumId="9" w15:restartNumberingAfterBreak="0">
+  <w:abstractNum w:abstractNumId="15" w15:restartNumberingAfterBreak="0">
+    <w:nsid w:val="58C41249"/>
+    <w:multiLevelType w:val="multilevel"/>
+    <w:tmpl w:val="3CCE1504"/>
+    <w:lvl w:ilvl="0">
+      <w:start w:val="1"/>
+      <w:numFmt w:val="bullet"/>
+      <w:lvlText w:val=""/>
+      <w:lvlJc w:val="left"/>
+      <w:pPr>
+        <w:tabs>
+          <w:tab w:val="num" w:pos="720"/>
+        </w:tabs>
+        <w:ind w:left="720" w:hanging="360"/>
+      </w:pPr>
+      <w:rPr>
+        <w:rFonts w:ascii="Symbol" w:hAnsi="Symbol" w:hint="default"/>
+        <w:sz w:val="20"/>
+      </w:rPr>
+    </w:lvl>
+    <w:lvl w:ilvl="1" w:tentative="1">
+      <w:start w:val="1"/>
+      <w:numFmt w:val="bullet"/>
+      <w:lvlText w:val="o"/>
+      <w:lvlJc w:val="left"/>
+      <w:pPr>
+        <w:tabs>
+          <w:tab w:val="num" w:pos="1440"/>
+        </w:tabs>
+        <w:ind w:left="1440" w:hanging="360"/>
+      </w:pPr>
+      <w:rPr>
+        <w:rFonts w:ascii="Courier New" w:hAnsi="Courier New" w:hint="default"/>
+        <w:sz w:val="20"/>
+      </w:rPr>
+    </w:lvl>
+    <w:lvl w:ilvl="2" w:tentative="1">
+      <w:start w:val="1"/>
+      <w:numFmt w:val="bullet"/>
+      <w:lvlText w:val=""/>
+      <w:lvlJc w:val="left"/>
+      <w:pPr>
+        <w:tabs>
+          <w:tab w:val="num" w:pos="2160"/>
+        </w:tabs>
+        <w:ind w:left="2160" w:hanging="360"/>
+      </w:pPr>
+      <w:rPr>
+        <w:rFonts w:ascii="Wingdings" w:hAnsi="Wingdings" w:hint="default"/>
+        <w:sz w:val="20"/>
+      </w:rPr>
+    </w:lvl>
+    <w:lvl w:ilvl="3" w:tentative="1">
+      <w:start w:val="1"/>
+      <w:numFmt w:val="bullet"/>
+      <w:lvlText w:val=""/>
+      <w:lvlJc w:val="left"/>
+      <w:pPr>
+        <w:tabs>
+          <w:tab w:val="num" w:pos="2880"/>
+        </w:tabs>
+        <w:ind w:left="2880" w:hanging="360"/>
+      </w:pPr>
+      <w:rPr>
+        <w:rFonts w:ascii="Wingdings" w:hAnsi="Wingdings" w:hint="default"/>
+        <w:sz w:val="20"/>
+      </w:rPr>
+    </w:lvl>
+    <w:lvl w:ilvl="4" w:tentative="1">
+      <w:start w:val="1"/>
+      <w:numFmt w:val="bullet"/>
+      <w:lvlText w:val=""/>
+      <w:lvlJc w:val="left"/>
+      <w:pPr>
+        <w:tabs>
+          <w:tab w:val="num" w:pos="3600"/>
+        </w:tabs>
+        <w:ind w:left="3600" w:hanging="360"/>
+      </w:pPr>
+      <w:rPr>
+        <w:rFonts w:ascii="Wingdings" w:hAnsi="Wingdings" w:hint="default"/>
+        <w:sz w:val="20"/>
+      </w:rPr>
+    </w:lvl>
+    <w:lvl w:ilvl="5" w:tentative="1">
+      <w:start w:val="1"/>
+      <w:numFmt w:val="bullet"/>
+      <w:lvlText w:val=""/>
+      <w:lvlJc w:val="left"/>
+      <w:pPr>
+        <w:tabs>
+          <w:tab w:val="num" w:pos="4320"/>
+        </w:tabs>
+        <w:ind w:left="4320" w:hanging="360"/>
+      </w:pPr>
+      <w:rPr>
+        <w:rFonts w:ascii="Wingdings" w:hAnsi="Wingdings" w:hint="default"/>
+        <w:sz w:val="20"/>
+      </w:rPr>
+    </w:lvl>
+    <w:lvl w:ilvl="6" w:tentative="1">
+      <w:start w:val="1"/>
+      <w:numFmt w:val="bullet"/>
+      <w:lvlText w:val=""/>
+      <w:lvlJc w:val="left"/>
+      <w:pPr>
+        <w:tabs>
+          <w:tab w:val="num" w:pos="5040"/>
+        </w:tabs>
+        <w:ind w:left="5040" w:hanging="360"/>
+      </w:pPr>
+      <w:rPr>
+        <w:rFonts w:ascii="Wingdings" w:hAnsi="Wingdings" w:hint="default"/>
+        <w:sz w:val="20"/>
+      </w:rPr>
+    </w:lvl>
+    <w:lvl w:ilvl="7" w:tentative="1">
+      <w:start w:val="1"/>
+      <w:numFmt w:val="bullet"/>
+      <w:lvlText w:val=""/>
+      <w:lvlJc w:val="left"/>
+      <w:pPr>
+        <w:tabs>
+          <w:tab w:val="num" w:pos="5760"/>
+        </w:tabs>
+        <w:ind w:left="5760" w:hanging="360"/>
+      </w:pPr>
+      <w:rPr>
+        <w:rFonts w:ascii="Wingdings" w:hAnsi="Wingdings" w:hint="default"/>
+        <w:sz w:val="20"/>
+      </w:rPr>
+    </w:lvl>
+    <w:lvl w:ilvl="8" w:tentative="1">
+      <w:start w:val="1"/>
+      <w:numFmt w:val="bullet"/>
+      <w:lvlText w:val=""/>
+      <w:lvlJc w:val="left"/>
+      <w:pPr>
+        <w:tabs>
+          <w:tab w:val="num" w:pos="6480"/>
+        </w:tabs>
+        <w:ind w:left="6480" w:hanging="360"/>
+      </w:pPr>
+      <w:rPr>
+        <w:rFonts w:ascii="Wingdings" w:hAnsi="Wingdings" w:hint="default"/>
+        <w:sz w:val="20"/>
+      </w:rPr>
+    </w:lvl>
+  </w:abstractNum>
+  <w:abstractNum w:abstractNumId="16" w15:restartNumberingAfterBreak="0">
+    <w:nsid w:val="65A65B19"/>
+    <w:multiLevelType w:val="multilevel"/>
+    <w:tmpl w:val="35EC1432"/>
+    <w:lvl w:ilvl="0">
+      <w:start w:val="1"/>
+      <w:numFmt w:val="bullet"/>
+      <w:lvlText w:val=""/>
+      <w:lvlJc w:val="left"/>
+      <w:pPr>
+        <w:tabs>
+          <w:tab w:val="num" w:pos="720"/>
+        </w:tabs>
+        <w:ind w:left="720" w:hanging="360"/>
+      </w:pPr>
+      <w:rPr>
+        <w:rFonts w:ascii="Symbol" w:hAnsi="Symbol" w:hint="default"/>
+        <w:sz w:val="20"/>
+      </w:rPr>
+    </w:lvl>
+    <w:lvl w:ilvl="1" w:tentative="1">
+      <w:start w:val="1"/>
+      <w:numFmt w:val="bullet"/>
+      <w:lvlText w:val="o"/>
+      <w:lvlJc w:val="left"/>
+      <w:pPr>
+        <w:tabs>
+          <w:tab w:val="num" w:pos="1440"/>
+        </w:tabs>
+        <w:ind w:left="1440" w:hanging="360"/>
+      </w:pPr>
+      <w:rPr>
+        <w:rFonts w:ascii="Courier New" w:hAnsi="Courier New" w:hint="default"/>
+        <w:sz w:val="20"/>
+      </w:rPr>
+    </w:lvl>
+    <w:lvl w:ilvl="2" w:tentative="1">
+      <w:start w:val="1"/>
+      <w:numFmt w:val="bullet"/>
+      <w:lvlText w:val=""/>
+      <w:lvlJc w:val="left"/>
+      <w:pPr>
+        <w:tabs>
+          <w:tab w:val="num" w:pos="2160"/>
+        </w:tabs>
+        <w:ind w:left="2160" w:hanging="360"/>
+      </w:pPr>
+      <w:rPr>
+        <w:rFonts w:ascii="Wingdings" w:hAnsi="Wingdings" w:hint="default"/>
+        <w:sz w:val="20"/>
+      </w:rPr>
+    </w:lvl>
+    <w:lvl w:ilvl="3" w:tentative="1">
+      <w:start w:val="1"/>
+      <w:numFmt w:val="bullet"/>
+      <w:lvlText w:val=""/>
+      <w:lvlJc w:val="left"/>
+      <w:pPr>
+        <w:tabs>
+          <w:tab w:val="num" w:pos="2880"/>
+        </w:tabs>
+        <w:ind w:left="2880" w:hanging="360"/>
+      </w:pPr>
+      <w:rPr>
+        <w:rFonts w:ascii="Wingdings" w:hAnsi="Wingdings" w:hint="default"/>
+        <w:sz w:val="20"/>
+      </w:rPr>
+    </w:lvl>
+    <w:lvl w:ilvl="4" w:tentative="1">
+      <w:start w:val="1"/>
+      <w:numFmt w:val="bullet"/>
+      <w:lvlText w:val=""/>
+      <w:lvlJc w:val="left"/>
+      <w:pPr>
+        <w:tabs>
+          <w:tab w:val="num" w:pos="3600"/>
+        </w:tabs>
+        <w:ind w:left="3600" w:hanging="360"/>
+      </w:pPr>
+      <w:rPr>
+        <w:rFonts w:ascii="Wingdings" w:hAnsi="Wingdings" w:hint="default"/>
+        <w:sz w:val="20"/>
+      </w:rPr>
+    </w:lvl>
+    <w:lvl w:ilvl="5" w:tentative="1">
+      <w:start w:val="1"/>
+      <w:numFmt w:val="bullet"/>
+      <w:lvlText w:val=""/>
+      <w:lvlJc w:val="left"/>
+      <w:pPr>
+        <w:tabs>
+          <w:tab w:val="num" w:pos="4320"/>
+        </w:tabs>
+        <w:ind w:left="4320" w:hanging="360"/>
+      </w:pPr>
+      <w:rPr>
+        <w:rFonts w:ascii="Wingdings" w:hAnsi="Wingdings" w:hint="default"/>
+        <w:sz w:val="20"/>
+      </w:rPr>
+    </w:lvl>
+    <w:lvl w:ilvl="6" w:tentative="1">
+      <w:start w:val="1"/>
+      <w:numFmt w:val="bullet"/>
+      <w:lvlText w:val=""/>
+      <w:lvlJc w:val="left"/>
+      <w:pPr>
+        <w:tabs>
+          <w:tab w:val="num" w:pos="5040"/>
+        </w:tabs>
+        <w:ind w:left="5040" w:hanging="360"/>
+      </w:pPr>
+      <w:rPr>
+        <w:rFonts w:ascii="Wingdings" w:hAnsi="Wingdings" w:hint="default"/>
+        <w:sz w:val="20"/>
+      </w:rPr>
+    </w:lvl>
+    <w:lvl w:ilvl="7" w:tentative="1">
+      <w:start w:val="1"/>
+      <w:numFmt w:val="bullet"/>
+      <w:lvlText w:val=""/>
+      <w:lvlJc w:val="left"/>
+      <w:pPr>
+        <w:tabs>
+          <w:tab w:val="num" w:pos="5760"/>
+        </w:tabs>
+        <w:ind w:left="5760" w:hanging="360"/>
+      </w:pPr>
+      <w:rPr>
+        <w:rFonts w:ascii="Wingdings" w:hAnsi="Wingdings" w:hint="default"/>
+        <w:sz w:val="20"/>
+      </w:rPr>
+    </w:lvl>
+    <w:lvl w:ilvl="8" w:tentative="1">
+      <w:start w:val="1"/>
+      <w:numFmt w:val="bullet"/>
+      <w:lvlText w:val=""/>
+      <w:lvlJc w:val="left"/>
+      <w:pPr>
+        <w:tabs>
+          <w:tab w:val="num" w:pos="6480"/>
+        </w:tabs>
+        <w:ind w:left="6480" w:hanging="360"/>
+      </w:pPr>
+      <w:rPr>
+        <w:rFonts w:ascii="Wingdings" w:hAnsi="Wingdings" w:hint="default"/>
+        <w:sz w:val="20"/>
+      </w:rPr>
+    </w:lvl>
+  </w:abstractNum>
+  <w:abstractNum w:abstractNumId="17" w15:restartNumberingAfterBreak="0">
     <w:nsid w:val="666050E5"/>
     <w:multiLevelType w:val="multilevel"/>
     <w:tmpl w:val="6D6EA5DE"/>
@@ -3572,7 +5169,7 @@
       </w:pPr>
     </w:lvl>
   </w:abstractNum>
-  <w:abstractNum w:abstractNumId="10" w15:restartNumberingAfterBreak="0">
+  <w:abstractNum w:abstractNumId="18" w15:restartNumberingAfterBreak="0">
     <w:nsid w:val="6A505256"/>
     <w:multiLevelType w:val="multilevel"/>
     <w:tmpl w:val="F0D2609A"/>
@@ -3721,7 +5318,7 @@
       </w:rPr>
     </w:lvl>
   </w:abstractNum>
-  <w:abstractNum w:abstractNumId="11" w15:restartNumberingAfterBreak="0">
+  <w:abstractNum w:abstractNumId="19" w15:restartNumberingAfterBreak="0">
     <w:nsid w:val="6B015C7E"/>
     <w:multiLevelType w:val="multilevel"/>
     <w:tmpl w:val="179AF056"/>
@@ -3870,7 +5467,156 @@
       </w:rPr>
     </w:lvl>
   </w:abstractNum>
-  <w:abstractNum w:abstractNumId="12" w15:restartNumberingAfterBreak="0">
+  <w:abstractNum w:abstractNumId="20" w15:restartNumberingAfterBreak="0">
+    <w:nsid w:val="742F7005"/>
+    <w:multiLevelType w:val="multilevel"/>
+    <w:tmpl w:val="889C4D42"/>
+    <w:lvl w:ilvl="0">
+      <w:start w:val="1"/>
+      <w:numFmt w:val="bullet"/>
+      <w:lvlText w:val=""/>
+      <w:lvlJc w:val="left"/>
+      <w:pPr>
+        <w:tabs>
+          <w:tab w:val="num" w:pos="720"/>
+        </w:tabs>
+        <w:ind w:left="720" w:hanging="360"/>
+      </w:pPr>
+      <w:rPr>
+        <w:rFonts w:ascii="Symbol" w:hAnsi="Symbol" w:hint="default"/>
+        <w:sz w:val="20"/>
+      </w:rPr>
+    </w:lvl>
+    <w:lvl w:ilvl="1" w:tentative="1">
+      <w:start w:val="1"/>
+      <w:numFmt w:val="bullet"/>
+      <w:lvlText w:val="o"/>
+      <w:lvlJc w:val="left"/>
+      <w:pPr>
+        <w:tabs>
+          <w:tab w:val="num" w:pos="1440"/>
+        </w:tabs>
+        <w:ind w:left="1440" w:hanging="360"/>
+      </w:pPr>
+      <w:rPr>
+        <w:rFonts w:ascii="Courier New" w:hAnsi="Courier New" w:hint="default"/>
+        <w:sz w:val="20"/>
+      </w:rPr>
+    </w:lvl>
+    <w:lvl w:ilvl="2" w:tentative="1">
+      <w:start w:val="1"/>
+      <w:numFmt w:val="bullet"/>
+      <w:lvlText w:val=""/>
+      <w:lvlJc w:val="left"/>
+      <w:pPr>
+        <w:tabs>
+          <w:tab w:val="num" w:pos="2160"/>
+        </w:tabs>
+        <w:ind w:left="2160" w:hanging="360"/>
+      </w:pPr>
+      <w:rPr>
+        <w:rFonts w:ascii="Wingdings" w:hAnsi="Wingdings" w:hint="default"/>
+        <w:sz w:val="20"/>
+      </w:rPr>
+    </w:lvl>
+    <w:lvl w:ilvl="3" w:tentative="1">
+      <w:start w:val="1"/>
+      <w:numFmt w:val="bullet"/>
+      <w:lvlText w:val=""/>
+      <w:lvlJc w:val="left"/>
+      <w:pPr>
+        <w:tabs>
+          <w:tab w:val="num" w:pos="2880"/>
+        </w:tabs>
+        <w:ind w:left="2880" w:hanging="360"/>
+      </w:pPr>
+      <w:rPr>
+        <w:rFonts w:ascii="Wingdings" w:hAnsi="Wingdings" w:hint="default"/>
+        <w:sz w:val="20"/>
+      </w:rPr>
+    </w:lvl>
+    <w:lvl w:ilvl="4" w:tentative="1">
+      <w:start w:val="1"/>
+      <w:numFmt w:val="bullet"/>
+      <w:lvlText w:val=""/>
+      <w:lvlJc w:val="left"/>
+      <w:pPr>
+        <w:tabs>
+          <w:tab w:val="num" w:pos="3600"/>
+        </w:tabs>
+        <w:ind w:left="3600" w:hanging="360"/>
+      </w:pPr>
+      <w:rPr>
+        <w:rFonts w:ascii="Wingdings" w:hAnsi="Wingdings" w:hint="default"/>
+        <w:sz w:val="20"/>
+      </w:rPr>
+    </w:lvl>
+    <w:lvl w:ilvl="5" w:tentative="1">
+      <w:start w:val="1"/>
+      <w:numFmt w:val="bullet"/>
+      <w:lvlText w:val=""/>
+      <w:lvlJc w:val="left"/>
+      <w:pPr>
+        <w:tabs>
+          <w:tab w:val="num" w:pos="4320"/>
+        </w:tabs>
+        <w:ind w:left="4320" w:hanging="360"/>
+      </w:pPr>
+      <w:rPr>
+        <w:rFonts w:ascii="Wingdings" w:hAnsi="Wingdings" w:hint="default"/>
+        <w:sz w:val="20"/>
+      </w:rPr>
+    </w:lvl>
+    <w:lvl w:ilvl="6" w:tentative="1">
+      <w:start w:val="1"/>
+      <w:numFmt w:val="bullet"/>
+      <w:lvlText w:val=""/>
+      <w:lvlJc w:val="left"/>
+      <w:pPr>
+        <w:tabs>
+          <w:tab w:val="num" w:pos="5040"/>
+        </w:tabs>
+        <w:ind w:left="5040" w:hanging="360"/>
+      </w:pPr>
+      <w:rPr>
+        <w:rFonts w:ascii="Wingdings" w:hAnsi="Wingdings" w:hint="default"/>
+        <w:sz w:val="20"/>
+      </w:rPr>
+    </w:lvl>
+    <w:lvl w:ilvl="7" w:tentative="1">
+      <w:start w:val="1"/>
+      <w:numFmt w:val="bullet"/>
+      <w:lvlText w:val=""/>
+      <w:lvlJc w:val="left"/>
+      <w:pPr>
+        <w:tabs>
+          <w:tab w:val="num" w:pos="5760"/>
+        </w:tabs>
+        <w:ind w:left="5760" w:hanging="360"/>
+      </w:pPr>
+      <w:rPr>
+        <w:rFonts w:ascii="Wingdings" w:hAnsi="Wingdings" w:hint="default"/>
+        <w:sz w:val="20"/>
+      </w:rPr>
+    </w:lvl>
+    <w:lvl w:ilvl="8" w:tentative="1">
+      <w:start w:val="1"/>
+      <w:numFmt w:val="bullet"/>
+      <w:lvlText w:val=""/>
+      <w:lvlJc w:val="left"/>
+      <w:pPr>
+        <w:tabs>
+          <w:tab w:val="num" w:pos="6480"/>
+        </w:tabs>
+        <w:ind w:left="6480" w:hanging="360"/>
+      </w:pPr>
+      <w:rPr>
+        <w:rFonts w:ascii="Wingdings" w:hAnsi="Wingdings" w:hint="default"/>
+        <w:sz w:val="20"/>
+      </w:rPr>
+    </w:lvl>
+  </w:abstractNum>
+  <w:abstractNum w:abstractNumId="21" w15:restartNumberingAfterBreak="0">
     <w:nsid w:val="78081846"/>
     <w:multiLevelType w:val="multilevel"/>
     <w:tmpl w:val="E15E95E6"/>
@@ -4019,7 +5765,7 @@
       </w:rPr>
     </w:lvl>
   </w:abstractNum>
-  <w:abstractNum w:abstractNumId="13" w15:restartNumberingAfterBreak="0">
+  <w:abstractNum w:abstractNumId="22" w15:restartNumberingAfterBreak="0">
     <w:nsid w:val="79213940"/>
     <w:multiLevelType w:val="multilevel"/>
     <w:tmpl w:val="0A189B8C"/>
@@ -4168,7 +5914,7 @@
       </w:rPr>
     </w:lvl>
   </w:abstractNum>
-  <w:abstractNum w:abstractNumId="14" w15:restartNumberingAfterBreak="0">
+  <w:abstractNum w:abstractNumId="23" w15:restartNumberingAfterBreak="0">
     <w:nsid w:val="7A556412"/>
     <w:multiLevelType w:val="multilevel"/>
     <w:tmpl w:val="93C68926"/>
@@ -4317,7 +6063,7 @@
       </w:rPr>
     </w:lvl>
   </w:abstractNum>
-  <w:abstractNum w:abstractNumId="15" w15:restartNumberingAfterBreak="0">
+  <w:abstractNum w:abstractNumId="24" w15:restartNumberingAfterBreak="0">
     <w:nsid w:val="7D376A17"/>
     <w:multiLevelType w:val="multilevel"/>
     <w:tmpl w:val="A6DA79C6"/>
@@ -4466,53 +6212,232 @@
       </w:rPr>
     </w:lvl>
   </w:abstractNum>
+  <w:abstractNum w:abstractNumId="25" w15:restartNumberingAfterBreak="0">
+    <w:nsid w:val="7E584A1E"/>
+    <w:multiLevelType w:val="multilevel"/>
+    <w:tmpl w:val="36FCC368"/>
+    <w:lvl w:ilvl="0">
+      <w:start w:val="1"/>
+      <w:numFmt w:val="bullet"/>
+      <w:lvlText w:val=""/>
+      <w:lvlJc w:val="left"/>
+      <w:pPr>
+        <w:tabs>
+          <w:tab w:val="num" w:pos="720"/>
+        </w:tabs>
+        <w:ind w:left="720" w:hanging="360"/>
+      </w:pPr>
+      <w:rPr>
+        <w:rFonts w:ascii="Symbol" w:hAnsi="Symbol" w:hint="default"/>
+        <w:sz w:val="20"/>
+      </w:rPr>
+    </w:lvl>
+    <w:lvl w:ilvl="1" w:tentative="1">
+      <w:start w:val="1"/>
+      <w:numFmt w:val="bullet"/>
+      <w:lvlText w:val="o"/>
+      <w:lvlJc w:val="left"/>
+      <w:pPr>
+        <w:tabs>
+          <w:tab w:val="num" w:pos="1440"/>
+        </w:tabs>
+        <w:ind w:left="1440" w:hanging="360"/>
+      </w:pPr>
+      <w:rPr>
+        <w:rFonts w:ascii="Courier New" w:hAnsi="Courier New" w:hint="default"/>
+        <w:sz w:val="20"/>
+      </w:rPr>
+    </w:lvl>
+    <w:lvl w:ilvl="2" w:tentative="1">
+      <w:start w:val="1"/>
+      <w:numFmt w:val="bullet"/>
+      <w:lvlText w:val=""/>
+      <w:lvlJc w:val="left"/>
+      <w:pPr>
+        <w:tabs>
+          <w:tab w:val="num" w:pos="2160"/>
+        </w:tabs>
+        <w:ind w:left="2160" w:hanging="360"/>
+      </w:pPr>
+      <w:rPr>
+        <w:rFonts w:ascii="Wingdings" w:hAnsi="Wingdings" w:hint="default"/>
+        <w:sz w:val="20"/>
+      </w:rPr>
+    </w:lvl>
+    <w:lvl w:ilvl="3" w:tentative="1">
+      <w:start w:val="1"/>
+      <w:numFmt w:val="bullet"/>
+      <w:lvlText w:val=""/>
+      <w:lvlJc w:val="left"/>
+      <w:pPr>
+        <w:tabs>
+          <w:tab w:val="num" w:pos="2880"/>
+        </w:tabs>
+        <w:ind w:left="2880" w:hanging="360"/>
+      </w:pPr>
+      <w:rPr>
+        <w:rFonts w:ascii="Wingdings" w:hAnsi="Wingdings" w:hint="default"/>
+        <w:sz w:val="20"/>
+      </w:rPr>
+    </w:lvl>
+    <w:lvl w:ilvl="4" w:tentative="1">
+      <w:start w:val="1"/>
+      <w:numFmt w:val="bullet"/>
+      <w:lvlText w:val=""/>
+      <w:lvlJc w:val="left"/>
+      <w:pPr>
+        <w:tabs>
+          <w:tab w:val="num" w:pos="3600"/>
+        </w:tabs>
+        <w:ind w:left="3600" w:hanging="360"/>
+      </w:pPr>
+      <w:rPr>
+        <w:rFonts w:ascii="Wingdings" w:hAnsi="Wingdings" w:hint="default"/>
+        <w:sz w:val="20"/>
+      </w:rPr>
+    </w:lvl>
+    <w:lvl w:ilvl="5" w:tentative="1">
+      <w:start w:val="1"/>
+      <w:numFmt w:val="bullet"/>
+      <w:lvlText w:val=""/>
+      <w:lvlJc w:val="left"/>
+      <w:pPr>
+        <w:tabs>
+          <w:tab w:val="num" w:pos="4320"/>
+        </w:tabs>
+        <w:ind w:left="4320" w:hanging="360"/>
+      </w:pPr>
+      <w:rPr>
+        <w:rFonts w:ascii="Wingdings" w:hAnsi="Wingdings" w:hint="default"/>
+        <w:sz w:val="20"/>
+      </w:rPr>
+    </w:lvl>
+    <w:lvl w:ilvl="6" w:tentative="1">
+      <w:start w:val="1"/>
+      <w:numFmt w:val="bullet"/>
+      <w:lvlText w:val=""/>
+      <w:lvlJc w:val="left"/>
+      <w:pPr>
+        <w:tabs>
+          <w:tab w:val="num" w:pos="5040"/>
+        </w:tabs>
+        <w:ind w:left="5040" w:hanging="360"/>
+      </w:pPr>
+      <w:rPr>
+        <w:rFonts w:ascii="Wingdings" w:hAnsi="Wingdings" w:hint="default"/>
+        <w:sz w:val="20"/>
+      </w:rPr>
+    </w:lvl>
+    <w:lvl w:ilvl="7" w:tentative="1">
+      <w:start w:val="1"/>
+      <w:numFmt w:val="bullet"/>
+      <w:lvlText w:val=""/>
+      <w:lvlJc w:val="left"/>
+      <w:pPr>
+        <w:tabs>
+          <w:tab w:val="num" w:pos="5760"/>
+        </w:tabs>
+        <w:ind w:left="5760" w:hanging="360"/>
+      </w:pPr>
+      <w:rPr>
+        <w:rFonts w:ascii="Wingdings" w:hAnsi="Wingdings" w:hint="default"/>
+        <w:sz w:val="20"/>
+      </w:rPr>
+    </w:lvl>
+    <w:lvl w:ilvl="8" w:tentative="1">
+      <w:start w:val="1"/>
+      <w:numFmt w:val="bullet"/>
+      <w:lvlText w:val=""/>
+      <w:lvlJc w:val="left"/>
+      <w:pPr>
+        <w:tabs>
+          <w:tab w:val="num" w:pos="6480"/>
+        </w:tabs>
+        <w:ind w:left="6480" w:hanging="360"/>
+      </w:pPr>
+      <w:rPr>
+        <w:rFonts w:ascii="Wingdings" w:hAnsi="Wingdings" w:hint="default"/>
+        <w:sz w:val="20"/>
+      </w:rPr>
+    </w:lvl>
+  </w:abstractNum>
   <w:num w:numId="1" w16cid:durableId="1843860302">
+    <w:abstractNumId w:val="22"/>
+  </w:num>
+  <w:num w:numId="2" w16cid:durableId="1091048925">
+    <w:abstractNumId w:val="12"/>
+  </w:num>
+  <w:num w:numId="3" w16cid:durableId="1788693466">
     <w:abstractNumId w:val="13"/>
   </w:num>
-  <w:num w:numId="2" w16cid:durableId="1091048925">
+  <w:num w:numId="4" w16cid:durableId="562175566">
+    <w:abstractNumId w:val="10"/>
+  </w:num>
+  <w:num w:numId="5" w16cid:durableId="2127889200">
+    <w:abstractNumId w:val="23"/>
+  </w:num>
+  <w:num w:numId="6" w16cid:durableId="289752511">
+    <w:abstractNumId w:val="21"/>
+  </w:num>
+  <w:num w:numId="7" w16cid:durableId="1540897404">
+    <w:abstractNumId w:val="11"/>
+  </w:num>
+  <w:num w:numId="8" w16cid:durableId="1649435619">
+    <w:abstractNumId w:val="19"/>
+  </w:num>
+  <w:num w:numId="9" w16cid:durableId="416362486">
+    <w:abstractNumId w:val="24"/>
+  </w:num>
+  <w:num w:numId="10" w16cid:durableId="2007631584">
+    <w:abstractNumId w:val="5"/>
+  </w:num>
+  <w:num w:numId="11" w16cid:durableId="1963226349">
+    <w:abstractNumId w:val="17"/>
+  </w:num>
+  <w:num w:numId="12" w16cid:durableId="995185389">
+    <w:abstractNumId w:val="18"/>
+  </w:num>
+  <w:num w:numId="13" w16cid:durableId="1504083603">
+    <w:abstractNumId w:val="1"/>
+  </w:num>
+  <w:num w:numId="14" w16cid:durableId="1326932156">
+    <w:abstractNumId w:val="7"/>
+  </w:num>
+  <w:num w:numId="15" w16cid:durableId="2138796821">
+    <w:abstractNumId w:val="14"/>
+  </w:num>
+  <w:num w:numId="16" w16cid:durableId="1606499945">
+    <w:abstractNumId w:val="8"/>
+  </w:num>
+  <w:num w:numId="17" w16cid:durableId="1404837625">
+    <w:abstractNumId w:val="15"/>
+  </w:num>
+  <w:num w:numId="18" w16cid:durableId="682895953">
+    <w:abstractNumId w:val="20"/>
+  </w:num>
+  <w:num w:numId="19" w16cid:durableId="1711147001">
     <w:abstractNumId w:val="6"/>
   </w:num>
-  <w:num w:numId="3" w16cid:durableId="1788693466">
-    <w:abstractNumId w:val="7"/>
+  <w:num w:numId="20" w16cid:durableId="1988195599">
+    <w:abstractNumId w:val="25"/>
   </w:num>
-  <w:num w:numId="4" w16cid:durableId="562175566">
-    <w:abstractNumId w:val="4"/>
+  <w:num w:numId="21" w16cid:durableId="1815440614">
+    <w:abstractNumId w:val="0"/>
   </w:num>
-  <w:num w:numId="5" w16cid:durableId="2127889200">
-    <w:abstractNumId w:val="14"/>
+  <w:num w:numId="22" w16cid:durableId="499589196">
+    <w:abstractNumId w:val="2"/>
   </w:num>
-  <w:num w:numId="6" w16cid:durableId="289752511">
-    <w:abstractNumId w:val="12"/>
-  </w:num>
-  <w:num w:numId="7" w16cid:durableId="1540897404">
-    <w:abstractNumId w:val="5"/>
-  </w:num>
-  <w:num w:numId="8" w16cid:durableId="1649435619">
-    <w:abstractNumId w:val="11"/>
-  </w:num>
-  <w:num w:numId="9" w16cid:durableId="416362486">
-    <w:abstractNumId w:val="15"/>
-  </w:num>
-  <w:num w:numId="10" w16cid:durableId="2007631584">
-    <w:abstractNumId w:val="1"/>
-  </w:num>
-  <w:num w:numId="11" w16cid:durableId="1963226349">
+  <w:num w:numId="23" w16cid:durableId="1508717614">
     <w:abstractNumId w:val="9"/>
   </w:num>
-  <w:num w:numId="12" w16cid:durableId="995185389">
-    <w:abstractNumId w:val="10"/>
+  <w:num w:numId="24" w16cid:durableId="1048189680">
+    <w:abstractNumId w:val="3"/>
   </w:num>
-  <w:num w:numId="13" w16cid:durableId="1504083603">
-    <w:abstractNumId w:val="0"/>
+  <w:num w:numId="25" w16cid:durableId="428239328">
+    <w:abstractNumId w:val="16"/>
   </w:num>
-  <w:num w:numId="14" w16cid:durableId="1326932156">
-    <w:abstractNumId w:val="2"/>
-  </w:num>
-  <w:num w:numId="15" w16cid:durableId="2138796821">
-    <w:abstractNumId w:val="8"/>
-  </w:num>
-  <w:num w:numId="16" w16cid:durableId="1606499945">
-    <w:abstractNumId w:val="3"/>
+  <w:num w:numId="26" w16cid:durableId="1146050090">
+    <w:abstractNumId w:val="4"/>
   </w:num>
 </w:numbering>
 </file>
@@ -5433,6 +7358,17 @@
       <w:spacing w:val="5"/>
     </w:rPr>
   </w:style>
+  <w:style w:type="paragraph" w:styleId="NormalWeb">
+    <w:name w:val="Normal (Web)"/>
+    <w:basedOn w:val="Normal"/>
+    <w:uiPriority w:val="99"/>
+    <w:semiHidden/>
+    <w:unhideWhenUsed/>
+    <w:rsid w:val="00075B4D"/>
+    <w:rPr>
+      <w:rFonts w:ascii="Times New Roman" w:hAnsi="Times New Roman" w:cs="Times New Roman"/>
+    </w:rPr>
+  </w:style>
 </w:styles>
 </file>
 

</xml_diff>